<commit_message>
Dossier funéraire : section « Notre accompagnement » (communication, flocage, conseil, rédaction)
Co-Authored-By: Claude Sonnet 5.5 <noreply@anthropic.com>
Claude-Session: https://claude.ai/code/session_01GSJyNfSpKfJ6NJhj9v1Yvo
</commit_message>
<xml_diff>
--- a/dossier-accompagnement-funeraire/Dossier_Projet_Accompagnement_Funeraire.docx
+++ b/dossier-accompagnement-funeraire/Dossier_Projet_Accompagnement_Funeraire.docx
@@ -472,7 +472,7 @@
                 <w:sz w:val="20"/>
                 <w:szCs w:val="20"/>
               </w:rPr>
-              <w:t xml:space="preserve">0</w:t>
+              <w:t xml:space="preserve">★</w:t>
             </w:r>
           </w:p>
         </w:tc>
@@ -505,7 +505,7 @@
                 <w:sz w:val="20"/>
                 <w:szCs w:val="20"/>
               </w:rPr>
-              <w:t xml:space="preserve">Mode d’emploi et avertissements</w:t>
+              <w:t xml:space="preserve">Notre accompagnement : sur quoi nous pouvons vous aider</w:t>
             </w:r>
           </w:p>
         </w:tc>
@@ -544,7 +544,7 @@
                 <w:sz w:val="20"/>
                 <w:szCs w:val="20"/>
               </w:rPr>
-              <w:t xml:space="preserve">1</w:t>
+              <w:t xml:space="preserve">0</w:t>
             </w:r>
           </w:p>
         </w:tc>
@@ -578,7 +578,7 @@
                 <w:sz w:val="20"/>
                 <w:szCs w:val="20"/>
               </w:rPr>
-              <w:t xml:space="preserve">Le projet en une page : vision et positionnement</w:t>
+              <w:t xml:space="preserve">Mode d’emploi et avertissements</w:t>
             </w:r>
           </w:p>
         </w:tc>
@@ -617,7 +617,7 @@
                 <w:sz w:val="20"/>
                 <w:szCs w:val="20"/>
               </w:rPr>
-              <w:t xml:space="preserve">2</w:t>
+              <w:t xml:space="preserve">1</w:t>
             </w:r>
           </w:p>
         </w:tc>
@@ -650,7 +650,7 @@
                 <w:sz w:val="20"/>
                 <w:szCs w:val="20"/>
               </w:rPr>
-              <w:t xml:space="preserve">Cadre réglementaire : ce qu’elle a le droit de faire (et pas)</w:t>
+              <w:t xml:space="preserve">Le projet en une page : vision et positionnement</w:t>
             </w:r>
           </w:p>
         </w:tc>
@@ -689,7 +689,7 @@
                 <w:sz w:val="20"/>
                 <w:szCs w:val="20"/>
               </w:rPr>
-              <w:t xml:space="preserve">3</w:t>
+              <w:t xml:space="preserve">2</w:t>
             </w:r>
           </w:p>
         </w:tc>
@@ -723,7 +723,7 @@
                 <w:sz w:val="20"/>
                 <w:szCs w:val="20"/>
               </w:rPr>
-              <w:t xml:space="preserve">Statut juridique, fiscal et création de l’entreprise</w:t>
+              <w:t xml:space="preserve">Cadre réglementaire : ce qu’elle a le droit de faire (et pas)</w:t>
             </w:r>
           </w:p>
         </w:tc>
@@ -762,7 +762,7 @@
                 <w:sz w:val="20"/>
                 <w:szCs w:val="20"/>
               </w:rPr>
-              <w:t xml:space="preserve">4</w:t>
+              <w:t xml:space="preserve">3</w:t>
             </w:r>
           </w:p>
         </w:tc>
@@ -795,7 +795,7 @@
                 <w:sz w:val="20"/>
                 <w:szCs w:val="20"/>
               </w:rPr>
-              <w:t xml:space="preserve">Comptabilité, facturation et finances</w:t>
+              <w:t xml:space="preserve">Statut juridique, fiscal et création de l’entreprise</w:t>
             </w:r>
           </w:p>
         </w:tc>
@@ -834,7 +834,7 @@
                 <w:sz w:val="20"/>
                 <w:szCs w:val="20"/>
               </w:rPr>
-              <w:t xml:space="preserve">5</w:t>
+              <w:t xml:space="preserve">4</w:t>
             </w:r>
           </w:p>
         </w:tc>
@@ -868,7 +868,7 @@
                 <w:sz w:val="20"/>
                 <w:szCs w:val="20"/>
               </w:rPr>
-              <w:t xml:space="preserve">Assurances et responsabilités (RC Pro et autres)</w:t>
+              <w:t xml:space="preserve">Comptabilité, facturation et finances</w:t>
             </w:r>
           </w:p>
         </w:tc>
@@ -907,7 +907,7 @@
                 <w:sz w:val="20"/>
                 <w:szCs w:val="20"/>
               </w:rPr>
-              <w:t xml:space="preserve">6</w:t>
+              <w:t xml:space="preserve">5</w:t>
             </w:r>
           </w:p>
         </w:tc>
@@ -940,7 +940,7 @@
                 <w:sz w:val="20"/>
                 <w:szCs w:val="20"/>
               </w:rPr>
-              <w:t xml:space="preserve">L’offre de services, pôle par pôle</w:t>
+              <w:t xml:space="preserve">Assurances et responsabilités (RC Pro et autres)</w:t>
             </w:r>
           </w:p>
         </w:tc>
@@ -979,7 +979,7 @@
                 <w:sz w:val="20"/>
                 <w:szCs w:val="20"/>
               </w:rPr>
-              <w:t xml:space="preserve">7</w:t>
+              <w:t xml:space="preserve">6</w:t>
             </w:r>
           </w:p>
         </w:tc>
@@ -1013,7 +1013,7 @@
                 <w:sz w:val="20"/>
                 <w:szCs w:val="20"/>
               </w:rPr>
-              <w:t xml:space="preserve">Vente et relation avec les familles</w:t>
+              <w:t xml:space="preserve">L’offre de services, pôle par pôle</w:t>
             </w:r>
           </w:p>
         </w:tc>
@@ -1052,7 +1052,7 @@
                 <w:sz w:val="20"/>
                 <w:szCs w:val="20"/>
               </w:rPr>
-              <w:t xml:space="preserve">8</w:t>
+              <w:t xml:space="preserve">7</w:t>
             </w:r>
           </w:p>
         </w:tc>
@@ -1085,7 +1085,7 @@
                 <w:sz w:val="20"/>
                 <w:szCs w:val="20"/>
               </w:rPr>
-              <w:t xml:space="preserve">Communication : site web, Google, réseaux sociaux, partenariats</w:t>
+              <w:t xml:space="preserve">Vente et relation avec les familles</w:t>
             </w:r>
           </w:p>
         </w:tc>
@@ -1124,7 +1124,7 @@
                 <w:sz w:val="20"/>
                 <w:szCs w:val="20"/>
               </w:rPr>
-              <w:t xml:space="preserve">9</w:t>
+              <w:t xml:space="preserve">8</w:t>
             </w:r>
           </w:p>
         </w:tc>
@@ -1158,7 +1158,7 @@
                 <w:sz w:val="20"/>
                 <w:szCs w:val="20"/>
               </w:rPr>
-              <w:t xml:space="preserve">Organisation, moyens et fournisseurs</w:t>
+              <w:t xml:space="preserve">Communication : site web, Google, réseaux sociaux, partenariats</w:t>
             </w:r>
           </w:p>
         </w:tc>
@@ -1197,7 +1197,7 @@
                 <w:sz w:val="20"/>
                 <w:szCs w:val="20"/>
               </w:rPr>
-              <w:t xml:space="preserve">10</w:t>
+              <w:t xml:space="preserve">9</w:t>
             </w:r>
           </w:p>
         </w:tc>
@@ -1230,7 +1230,7 @@
                 <w:sz w:val="20"/>
                 <w:szCs w:val="20"/>
               </w:rPr>
-              <w:t xml:space="preserve">Plan de lancement sur 12 mois et budget de démarrage</w:t>
+              <w:t xml:space="preserve">Organisation, moyens et fournisseurs</w:t>
             </w:r>
           </w:p>
         </w:tc>
@@ -1269,7 +1269,7 @@
                 <w:sz w:val="20"/>
                 <w:szCs w:val="20"/>
               </w:rPr>
-              <w:t xml:space="preserve">11</w:t>
+              <w:t xml:space="preserve">10</w:t>
             </w:r>
           </w:p>
         </w:tc>
@@ -1303,7 +1303,7 @@
                 <w:sz w:val="20"/>
                 <w:szCs w:val="20"/>
               </w:rPr>
-              <w:t xml:space="preserve">Risques et points de vigilance</w:t>
+              <w:t xml:space="preserve">Plan de lancement sur 12 mois et budget de démarrage</w:t>
             </w:r>
           </w:p>
         </w:tc>
@@ -1342,7 +1342,7 @@
                 <w:sz w:val="20"/>
                 <w:szCs w:val="20"/>
               </w:rPr>
-              <w:t xml:space="preserve">A</w:t>
+              <w:t xml:space="preserve">11</w:t>
             </w:r>
           </w:p>
         </w:tc>
@@ -1375,7 +1375,7 @@
                 <w:sz w:val="20"/>
                 <w:szCs w:val="20"/>
               </w:rPr>
-              <w:t xml:space="preserve">Annexe A — Checklist « avant de lancer » (à cocher)</w:t>
+              <w:t xml:space="preserve">Risques et points de vigilance</w:t>
             </w:r>
           </w:p>
         </w:tc>
@@ -1414,7 +1414,7 @@
                 <w:sz w:val="20"/>
                 <w:szCs w:val="20"/>
               </w:rPr>
-              <w:t xml:space="preserve">B</w:t>
+              <w:t xml:space="preserve">A</w:t>
             </w:r>
           </w:p>
         </w:tc>
@@ -1448,7 +1448,7 @@
                 <w:sz w:val="20"/>
                 <w:szCs w:val="20"/>
               </w:rPr>
-              <w:t xml:space="preserve">Annexe B — Contacts et sources officielles</w:t>
+              <w:t xml:space="preserve">Annexe A — Checklist « avant de lancer » (à cocher)</w:t>
             </w:r>
           </w:p>
         </w:tc>
@@ -1487,7 +1487,7 @@
                 <w:sz w:val="20"/>
                 <w:szCs w:val="20"/>
               </w:rPr>
-              <w:t xml:space="preserve">C</w:t>
+              <w:t xml:space="preserve">B</w:t>
             </w:r>
           </w:p>
         </w:tc>
@@ -1520,7 +1520,7 @@
                 <w:sz w:val="20"/>
                 <w:szCs w:val="20"/>
               </w:rPr>
-              <w:t xml:space="preserve">Annexe C — Frise des démarches après un décès</w:t>
+              <w:t xml:space="preserve">Annexe B — Contacts et sources officielles</w:t>
             </w:r>
           </w:p>
         </w:tc>
@@ -1559,7 +1559,7 @@
                 <w:sz w:val="20"/>
                 <w:szCs w:val="20"/>
               </w:rPr>
-              <w:t xml:space="preserve">D</w:t>
+              <w:t xml:space="preserve">C</w:t>
             </w:r>
           </w:p>
         </w:tc>
@@ -1593,7 +1593,7 @@
                 <w:sz w:val="20"/>
                 <w:szCs w:val="20"/>
               </w:rPr>
-              <w:t xml:space="preserve">Annexe D — Trame de mandat et de devis</w:t>
+              <w:t xml:space="preserve">Annexe C — Frise des démarches après un décès</w:t>
             </w:r>
           </w:p>
         </w:tc>
@@ -1632,7 +1632,7 @@
                 <w:sz w:val="20"/>
                 <w:szCs w:val="20"/>
               </w:rPr>
-              <w:t xml:space="preserve">E</w:t>
+              <w:t xml:space="preserve">D</w:t>
             </w:r>
           </w:p>
         </w:tc>
@@ -1665,7 +1665,7 @@
                 <w:sz w:val="20"/>
                 <w:szCs w:val="20"/>
               </w:rPr>
-              <w:t xml:space="preserve">Annexe E — Questions à poser (comptable, assureur, juriste, préfecture)</w:t>
+              <w:t xml:space="preserve">Annexe D — Trame de mandat et de devis</w:t>
             </w:r>
           </w:p>
         </w:tc>
@@ -1704,7 +1704,7 @@
                 <w:sz w:val="20"/>
                 <w:szCs w:val="20"/>
               </w:rPr>
-              <w:t xml:space="preserve">F</w:t>
+              <w:t xml:space="preserve">E</w:t>
             </w:r>
           </w:p>
         </w:tc>
@@ -1738,7 +1738,7 @@
                 <w:sz w:val="20"/>
                 <w:szCs w:val="20"/>
               </w:rPr>
-              <w:t xml:space="preserve">Annexe F — Décisions à prendre : fiche à remplir</w:t>
+              <w:t xml:space="preserve">Annexe E — Questions à poser (comptable, assureur, juriste, préfecture)</w:t>
             </w:r>
           </w:p>
         </w:tc>
@@ -1777,7 +1777,7 @@
                 <w:sz w:val="20"/>
                 <w:szCs w:val="20"/>
               </w:rPr>
-              <w:t xml:space="preserve">G</w:t>
+              <w:t xml:space="preserve">F</w:t>
             </w:r>
           </w:p>
         </w:tc>
@@ -1810,7 +1810,7 @@
                 <w:sz w:val="20"/>
                 <w:szCs w:val="20"/>
               </w:rPr>
-              <w:t xml:space="preserve">Annexe G — Glossaire</w:t>
+              <w:t xml:space="preserve">Annexe F — Décisions à prendre : fiche à remplir</w:t>
             </w:r>
           </w:p>
         </w:tc>
@@ -1849,7 +1849,7 @@
                 <w:sz w:val="20"/>
                 <w:szCs w:val="20"/>
               </w:rPr>
-              <w:t xml:space="preserve">H</w:t>
+              <w:t xml:space="preserve">G</w:t>
             </w:r>
           </w:p>
         </w:tc>
@@ -1883,7 +1883,7 @@
                 <w:sz w:val="20"/>
                 <w:szCs w:val="20"/>
               </w:rPr>
-              <w:t xml:space="preserve">Annexe H — Textes prêts à l’emploi (site, Google, téléphone, avis)</w:t>
+              <w:t xml:space="preserve">Annexe G — Glossaire</w:t>
             </w:r>
           </w:p>
         </w:tc>
@@ -1922,7 +1922,7 @@
                 <w:sz w:val="20"/>
                 <w:szCs w:val="20"/>
               </w:rPr>
-              <w:t xml:space="preserve">I</w:t>
+              <w:t xml:space="preserve">H</w:t>
             </w:r>
           </w:p>
         </w:tc>
@@ -1955,7 +1955,7 @@
                 <w:sz w:val="20"/>
                 <w:szCs w:val="20"/>
               </w:rPr>
-              <w:t xml:space="preserve">Annexe I — Calendrier éditorial sur 12 mois</w:t>
+              <w:t xml:space="preserve">Annexe H — Textes prêts à l’emploi (site, Google, téléphone, avis)</w:t>
             </w:r>
           </w:p>
         </w:tc>
@@ -1994,7 +1994,7 @@
                 <w:sz w:val="20"/>
                 <w:szCs w:val="20"/>
               </w:rPr>
-              <w:t xml:space="preserve">J</w:t>
+              <w:t xml:space="preserve">I</w:t>
             </w:r>
           </w:p>
         </w:tc>
@@ -2028,7 +2028,7 @@
                 <w:sz w:val="20"/>
                 <w:szCs w:val="20"/>
               </w:rPr>
-              <w:t xml:space="preserve">Annexe J — Gamme textile et souvenirs (flocage) : cadre et processus</w:t>
+              <w:t xml:space="preserve">Annexe I — Calendrier éditorial sur 12 mois</w:t>
             </w:r>
           </w:p>
         </w:tc>
@@ -2067,7 +2067,7 @@
                 <w:sz w:val="20"/>
                 <w:szCs w:val="20"/>
               </w:rPr>
-              <w:t xml:space="preserve">K</w:t>
+              <w:t xml:space="preserve">J</w:t>
             </w:r>
           </w:p>
         </w:tc>
@@ -2100,7 +2100,2537 @@
                 <w:sz w:val="20"/>
                 <w:szCs w:val="20"/>
               </w:rPr>
+              <w:t xml:space="preserve">Annexe J — Gamme textile et souvenirs (flocage) : cadre et processus</w:t>
+            </w:r>
+          </w:p>
+        </w:tc>
+      </w:tr>
+      <w:tr>
+        <w:trPr>
+          <w:cantSplit/>
+        </w:trPr>
+        <w:tc>
+          <w:tcPr>
+            <w:tcW w:type="dxa" w:w="900"/>
+            <w:tcBorders>
+              <w:top w:val="single" w:color="C9D3CD" w:sz="4"/>
+              <w:left w:val="single" w:color="C9D3CD" w:sz="4"/>
+              <w:bottom w:val="single" w:color="C9D3CD" w:sz="4"/>
+              <w:right w:val="single" w:color="C9D3CD" w:sz="4"/>
+            </w:tcBorders>
+            <w:shd w:fill="EEF3F0" w:color="auto" w:val="clear"/>
+            <w:tcMar>
+              <w:top w:type="dxa" w:w="70"/>
+              <w:left w:type="dxa" w:w="110"/>
+              <w:bottom w:type="dxa" w:w="70"/>
+              <w:right w:type="dxa" w:w="110"/>
+            </w:tcMar>
+            <w:vAlign w:val="top"/>
+          </w:tcPr>
+          <w:p>
+            <w:pPr>
+              <w:spacing w:after="40"/>
+            </w:pPr>
+            <w:r>
+              <w:rPr>
+                <w:rFonts w:ascii="Calibri" w:cs="Calibri" w:eastAsia="Calibri" w:hAnsi="Calibri"/>
+                <w:b/>
+                <w:bCs/>
+                <w:sz w:val="20"/>
+                <w:szCs w:val="20"/>
+              </w:rPr>
+              <w:t xml:space="preserve">K</w:t>
+            </w:r>
+          </w:p>
+        </w:tc>
+        <w:tc>
+          <w:tcPr>
+            <w:tcW w:type="dxa" w:w="8738"/>
+            <w:tcBorders>
+              <w:top w:val="single" w:color="C9D3CD" w:sz="4"/>
+              <w:left w:val="single" w:color="C9D3CD" w:sz="4"/>
+              <w:bottom w:val="single" w:color="C9D3CD" w:sz="4"/>
+              <w:right w:val="single" w:color="C9D3CD" w:sz="4"/>
+            </w:tcBorders>
+            <w:shd w:fill="F8FAF9" w:color="auto" w:val="clear"/>
+            <w:tcMar>
+              <w:top w:type="dxa" w:w="70"/>
+              <w:left w:type="dxa" w:w="110"/>
+              <w:bottom w:type="dxa" w:w="70"/>
+              <w:right w:type="dxa" w:w="110"/>
+            </w:tcMar>
+            <w:vAlign w:val="top"/>
+          </w:tcPr>
+          <w:p>
+            <w:pPr>
+              <w:spacing w:after="40"/>
+            </w:pPr>
+            <w:r>
+              <w:rPr>
+                <w:rFonts w:ascii="Calibri" w:cs="Calibri" w:eastAsia="Calibri" w:hAnsi="Calibri"/>
+                <w:b w:val="false"/>
+                <w:bCs w:val="false"/>
+                <w:sz w:val="20"/>
+                <w:szCs w:val="20"/>
+              </w:rPr>
               <w:t xml:space="preserve">Annexe K — Étude locale : concurrents, mots-clés, partenaires</w:t>
+            </w:r>
+          </w:p>
+        </w:tc>
+      </w:tr>
+    </w:tbl>
+    <w:p>
+      <w:pPr>
+        <w:pStyle w:val="Heading1"/>
+        <w:pageBreakBefore/>
+        <w:pBdr>
+          <w:bottom w:val="single" w:color="5B7F6B" w:sz="12" w:space="4"/>
+        </w:pBdr>
+        <w:spacing w:after="240" w:before="0"/>
+      </w:pPr>
+      <w:r>
+        <w:rPr>
+          <w:rFonts w:ascii="Calibri" w:cs="Calibri" w:eastAsia="Calibri" w:hAnsi="Calibri"/>
+          <w:b/>
+          <w:bCs/>
+          <w:color w:val="1F3A5F"/>
+          <w:sz w:val="36"/>
+          <w:szCs w:val="36"/>
+        </w:rPr>
+        <w:t xml:space="preserve">Notre accompagnement : sur quoi nous pouvons vous aider</w:t>
+      </w:r>
+    </w:p>
+    <w:p>
+      <w:pPr>
+        <w:spacing w:after="120" w:line="276"/>
+      </w:pPr>
+      <w:r>
+        <w:rPr>
+          <w:rFonts w:ascii="Calibri" w:cs="Calibri" w:eastAsia="Calibri" w:hAnsi="Calibri"/>
+          <w:sz w:val="22"/>
+          <w:szCs w:val="22"/>
+        </w:rPr>
+        <w:t xml:space="preserve">Horizon Vendée est votre agence de communication. Voici, en un coup d’œil, </w:t>
+      </w:r>
+      <w:r>
+        <w:rPr>
+          <w:rFonts w:ascii="Calibri" w:cs="Calibri" w:eastAsia="Calibri" w:hAnsi="Calibri"/>
+          <w:b/>
+          <w:bCs/>
+          <w:sz w:val="22"/>
+          <w:szCs w:val="22"/>
+        </w:rPr>
+        <w:t xml:space="preserve">tout ce que nous pouvons prendre en charge</w:t>
+      </w:r>
+      <w:r>
+        <w:rPr>
+          <w:rFonts w:ascii="Calibri" w:cs="Calibri" w:eastAsia="Calibri" w:hAnsi="Calibri"/>
+          <w:sz w:val="22"/>
+          <w:szCs w:val="22"/>
+        </w:rPr>
+        <w:t xml:space="preserve"> pour le lancement de votre activité. Les pastilles de couleur de ce dossier renvoient à ces quatre familles. Les tarifs sont établis </w:t>
+      </w:r>
+      <w:r>
+        <w:rPr>
+          <w:rFonts w:ascii="Calibri" w:cs="Calibri" w:eastAsia="Calibri" w:hAnsi="Calibri"/>
+          <w:b/>
+          <w:bCs/>
+          <w:sz w:val="22"/>
+          <w:szCs w:val="22"/>
+        </w:rPr>
+        <w:t xml:space="preserve">sur devis, ensemble</w:t>
+      </w:r>
+      <w:r>
+        <w:rPr>
+          <w:rFonts w:ascii="Calibri" w:cs="Calibri" w:eastAsia="Calibri" w:hAnsi="Calibri"/>
+          <w:sz w:val="22"/>
+          <w:szCs w:val="22"/>
+        </w:rPr>
+        <w:t xml:space="preserve">, selon vos priorités et votre budget.</w:t>
+      </w:r>
+    </w:p>
+    <w:p>
+      <w:pPr>
+        <w:spacing w:after="80"/>
+      </w:pPr>
+    </w:p>
+    <w:tbl>
+      <w:tblPr>
+        <w:tblW w:type="dxa" w:w="9638"/>
+        <w:tblBorders>
+          <w:top w:val="single" w:color="auto" w:sz="4"/>
+          <w:left w:val="single" w:color="auto" w:sz="4"/>
+          <w:bottom w:val="single" w:color="auto" w:sz="4"/>
+          <w:right w:val="single" w:color="auto" w:sz="4"/>
+          <w:insideH w:val="single" w:color="auto" w:sz="4"/>
+          <w:insideV w:val="single" w:color="auto" w:sz="4"/>
+        </w:tblBorders>
+      </w:tblPr>
+      <w:tblGrid>
+        <w:gridCol w:w="4819"/>
+        <w:gridCol w:w="4819"/>
+      </w:tblGrid>
+      <w:tr>
+        <w:trPr>
+          <w:cantSplit/>
+        </w:trPr>
+        <w:tc>
+          <w:tcPr>
+            <w:tcW w:type="dxa" w:w="9638"/>
+            <w:gridSpan w:val="2"/>
+            <w:tcBorders>
+              <w:top w:val="single" w:color="7B4FBF" w:sz="4"/>
+              <w:left w:val="single" w:color="7B4FBF" w:sz="4"/>
+              <w:bottom w:val="single" w:color="7B4FBF" w:sz="4"/>
+              <w:right w:val="single" w:color="7B4FBF" w:sz="4"/>
+            </w:tcBorders>
+            <w:shd w:fill="7B4FBF" w:color="auto" w:val="clear"/>
+            <w:tcMar>
+              <w:top w:type="dxa" w:w="90"/>
+              <w:left w:type="dxa" w:w="160"/>
+              <w:bottom w:type="dxa" w:w="90"/>
+              <w:right w:type="dxa" w:w="160"/>
+            </w:tcMar>
+          </w:tcPr>
+          <w:p>
+            <w:pPr>
+              <w:spacing w:after="20"/>
+            </w:pPr>
+            <w:r>
+              <w:rPr>
+                <w:rFonts w:ascii="Calibri" w:cs="Calibri" w:eastAsia="Calibri" w:hAnsi="Calibri"/>
+                <w:b/>
+                <w:bCs/>
+                <w:color w:val="FFFFFF"/>
+                <w:sz w:val="26"/>
+                <w:szCs w:val="26"/>
+              </w:rPr>
+              <w:t xml:space="preserve">Communication digitale</w:t>
+            </w:r>
+          </w:p>
+          <w:p>
+            <w:r>
+              <w:rPr>
+                <w:rFonts w:ascii="Calibri" w:cs="Calibri" w:eastAsia="Calibri" w:hAnsi="Calibri"/>
+                <w:i/>
+                <w:iCs/>
+                <w:color w:val="FFFFFF"/>
+                <w:sz w:val="19"/>
+                <w:szCs w:val="19"/>
+              </w:rPr>
+              <w:t xml:space="preserve">Être trouvée facilement et inspirer confiance dès la première visite</w:t>
+            </w:r>
+          </w:p>
+        </w:tc>
+      </w:tr>
+      <w:tr>
+        <w:trPr>
+          <w:cantSplit/>
+        </w:trPr>
+        <w:tc>
+          <w:tcPr>
+            <w:tcW w:type="dxa" w:w="4819"/>
+            <w:tcBorders>
+              <w:top w:val="single" w:color="7B4FBF" w:sz="4"/>
+              <w:left w:val="single" w:color="7B4FBF" w:sz="4"/>
+              <w:bottom w:val="single" w:color="7B4FBF" w:sz="4"/>
+              <w:right w:val="single" w:color="7B4FBF" w:sz="4"/>
+            </w:tcBorders>
+            <w:shd w:fill="FAFAFA" w:color="auto" w:val="clear"/>
+            <w:tcMar>
+              <w:top w:type="dxa" w:w="90"/>
+              <w:left w:type="dxa" w:w="160"/>
+              <w:bottom w:type="dxa" w:w="60"/>
+              <w:right w:type="dxa" w:w="120"/>
+            </w:tcMar>
+          </w:tcPr>
+          <w:p>
+            <w:pPr>
+              <w:spacing w:after="50"/>
+              <w:ind w:left="300" w:hanging="300"/>
+            </w:pPr>
+            <w:r>
+              <w:rPr>
+                <w:rFonts w:ascii="Calibri" w:cs="Calibri" w:eastAsia="Calibri" w:hAnsi="Calibri"/>
+                <w:b/>
+                <w:bCs/>
+                <w:color w:val="7B4FBF"/>
+                <w:sz w:val="22"/>
+                <w:szCs w:val="22"/>
+              </w:rPr>
+              <w:t xml:space="preserve">✓  </w:t>
+            </w:r>
+            <w:r>
+              <w:rPr>
+                <w:rFonts w:ascii="Calibri" w:cs="Calibri" w:eastAsia="Calibri" w:hAnsi="Calibri"/>
+                <w:b/>
+                <w:bCs/>
+                <w:sz w:val="20"/>
+                <w:szCs w:val="20"/>
+              </w:rPr>
+              <w:t xml:space="preserve">Site web complet</w:t>
+            </w:r>
+            <w:r>
+              <w:rPr>
+                <w:rFonts w:ascii="Calibri" w:cs="Calibri" w:eastAsia="Calibri" w:hAnsi="Calibri"/>
+                <w:sz w:val="20"/>
+                <w:szCs w:val="20"/>
+              </w:rPr>
+              <w:t xml:space="preserve"> : conception, rédaction, adapté au téléphone, rapide et sécurisé</w:t>
+            </w:r>
+          </w:p>
+          <w:p>
+            <w:pPr>
+              <w:spacing w:after="50"/>
+              <w:ind w:left="300" w:hanging="300"/>
+            </w:pPr>
+            <w:r>
+              <w:rPr>
+                <w:rFonts w:ascii="Calibri" w:cs="Calibri" w:eastAsia="Calibri" w:hAnsi="Calibri"/>
+                <w:b/>
+                <w:bCs/>
+                <w:color w:val="7B4FBF"/>
+                <w:sz w:val="22"/>
+                <w:szCs w:val="22"/>
+              </w:rPr>
+              <w:t xml:space="preserve">✓  </w:t>
+            </w:r>
+            <w:r>
+              <w:rPr>
+                <w:rFonts w:ascii="Calibri" w:cs="Calibri" w:eastAsia="Calibri" w:hAnsi="Calibri"/>
+                <w:b/>
+                <w:bCs/>
+                <w:sz w:val="20"/>
+                <w:szCs w:val="20"/>
+              </w:rPr>
+              <w:t xml:space="preserve">Référencement local</w:t>
+            </w:r>
+            <w:r>
+              <w:rPr>
+                <w:rFonts w:ascii="Calibri" w:cs="Calibri" w:eastAsia="Calibri" w:hAnsi="Calibri"/>
+                <w:sz w:val="20"/>
+                <w:szCs w:val="20"/>
+              </w:rPr>
+              <w:t xml:space="preserve"> : pages par commune, mots-clés réels des familles</w:t>
+            </w:r>
+          </w:p>
+          <w:p>
+            <w:pPr>
+              <w:spacing w:after="50"/>
+              <w:ind w:left="300" w:hanging="300"/>
+            </w:pPr>
+            <w:r>
+              <w:rPr>
+                <w:rFonts w:ascii="Calibri" w:cs="Calibri" w:eastAsia="Calibri" w:hAnsi="Calibri"/>
+                <w:b/>
+                <w:bCs/>
+                <w:color w:val="7B4FBF"/>
+                <w:sz w:val="22"/>
+                <w:szCs w:val="22"/>
+              </w:rPr>
+              <w:t xml:space="preserve">✓  </w:t>
+            </w:r>
+            <w:r>
+              <w:rPr>
+                <w:rFonts w:ascii="Calibri" w:cs="Calibri" w:eastAsia="Calibri" w:hAnsi="Calibri"/>
+                <w:b/>
+                <w:bCs/>
+                <w:sz w:val="20"/>
+                <w:szCs w:val="20"/>
+              </w:rPr>
+              <w:t xml:space="preserve">Google Business Profile</w:t>
+            </w:r>
+            <w:r>
+              <w:rPr>
+                <w:rFonts w:ascii="Calibri" w:cs="Calibri" w:eastAsia="Calibri" w:hAnsi="Calibri"/>
+                <w:sz w:val="20"/>
+                <w:szCs w:val="20"/>
+              </w:rPr>
+              <w:t xml:space="preserve"> : création, validation, optimisation, photos</w:t>
+            </w:r>
+          </w:p>
+          <w:p>
+            <w:pPr>
+              <w:spacing w:after="50"/>
+              <w:ind w:left="300" w:hanging="300"/>
+            </w:pPr>
+            <w:r>
+              <w:rPr>
+                <w:rFonts w:ascii="Calibri" w:cs="Calibri" w:eastAsia="Calibri" w:hAnsi="Calibri"/>
+                <w:b/>
+                <w:bCs/>
+                <w:color w:val="7B4FBF"/>
+                <w:sz w:val="22"/>
+                <w:szCs w:val="22"/>
+              </w:rPr>
+              <w:t xml:space="preserve">✓  </w:t>
+            </w:r>
+            <w:r>
+              <w:rPr>
+                <w:rFonts w:ascii="Calibri" w:cs="Calibri" w:eastAsia="Calibri" w:hAnsi="Calibri"/>
+                <w:b/>
+                <w:bCs/>
+                <w:sz w:val="20"/>
+                <w:szCs w:val="20"/>
+              </w:rPr>
+              <w:t xml:space="preserve">Gestion des avis</w:t>
+            </w:r>
+            <w:r>
+              <w:rPr>
+                <w:rFonts w:ascii="Calibri" w:cs="Calibri" w:eastAsia="Calibri" w:hAnsi="Calibri"/>
+                <w:sz w:val="20"/>
+                <w:szCs w:val="20"/>
+              </w:rPr>
+              <w:t xml:space="preserve"> : carte avec QR code, réponses types, suivi</w:t>
+            </w:r>
+          </w:p>
+        </w:tc>
+        <w:tc>
+          <w:tcPr>
+            <w:tcW w:type="dxa" w:w="4819"/>
+            <w:tcBorders>
+              <w:top w:val="single" w:color="7B4FBF" w:sz="4"/>
+              <w:left w:val="single" w:color="7B4FBF" w:sz="4"/>
+              <w:bottom w:val="single" w:color="7B4FBF" w:sz="4"/>
+              <w:right w:val="single" w:color="7B4FBF" w:sz="4"/>
+            </w:tcBorders>
+            <w:shd w:fill="FAFAFA" w:color="auto" w:val="clear"/>
+            <w:tcMar>
+              <w:top w:type="dxa" w:w="90"/>
+              <w:left w:type="dxa" w:w="160"/>
+              <w:bottom w:type="dxa" w:w="60"/>
+              <w:right w:type="dxa" w:w="120"/>
+            </w:tcMar>
+          </w:tcPr>
+          <w:p>
+            <w:pPr>
+              <w:spacing w:after="50"/>
+              <w:ind w:left="300" w:hanging="300"/>
+            </w:pPr>
+            <w:r>
+              <w:rPr>
+                <w:rFonts w:ascii="Calibri" w:cs="Calibri" w:eastAsia="Calibri" w:hAnsi="Calibri"/>
+                <w:b/>
+                <w:bCs/>
+                <w:color w:val="7B4FBF"/>
+                <w:sz w:val="22"/>
+                <w:szCs w:val="22"/>
+              </w:rPr>
+              <w:t xml:space="preserve">✓  </w:t>
+            </w:r>
+            <w:r>
+              <w:rPr>
+                <w:rFonts w:ascii="Calibri" w:cs="Calibri" w:eastAsia="Calibri" w:hAnsi="Calibri"/>
+                <w:b/>
+                <w:bCs/>
+                <w:sz w:val="20"/>
+                <w:szCs w:val="20"/>
+              </w:rPr>
+              <w:t xml:space="preserve">Réseaux sociaux</w:t>
+            </w:r>
+            <w:r>
+              <w:rPr>
+                <w:rFonts w:ascii="Calibri" w:cs="Calibri" w:eastAsia="Calibri" w:hAnsi="Calibri"/>
+                <w:sz w:val="20"/>
+                <w:szCs w:val="20"/>
+              </w:rPr>
+              <w:t xml:space="preserve"> : pages Facebook / Instagram / LinkedIn, modèles de publications</w:t>
+            </w:r>
+          </w:p>
+          <w:p>
+            <w:pPr>
+              <w:spacing w:after="50"/>
+              <w:ind w:left="300" w:hanging="300"/>
+            </w:pPr>
+            <w:r>
+              <w:rPr>
+                <w:rFonts w:ascii="Calibri" w:cs="Calibri" w:eastAsia="Calibri" w:hAnsi="Calibri"/>
+                <w:b/>
+                <w:bCs/>
+                <w:color w:val="7B4FBF"/>
+                <w:sz w:val="22"/>
+                <w:szCs w:val="22"/>
+              </w:rPr>
+              <w:t xml:space="preserve">✓  </w:t>
+            </w:r>
+            <w:r>
+              <w:rPr>
+                <w:rFonts w:ascii="Calibri" w:cs="Calibri" w:eastAsia="Calibri" w:hAnsi="Calibri"/>
+                <w:b/>
+                <w:bCs/>
+                <w:sz w:val="20"/>
+                <w:szCs w:val="20"/>
+              </w:rPr>
+              <w:t xml:space="preserve">Calendrier de publication</w:t>
+            </w:r>
+            <w:r>
+              <w:rPr>
+                <w:rFonts w:ascii="Calibri" w:cs="Calibri" w:eastAsia="Calibri" w:hAnsi="Calibri"/>
+                <w:sz w:val="20"/>
+                <w:szCs w:val="20"/>
+              </w:rPr>
+              <w:t xml:space="preserve"> sur 12 mois, y compris Toussaint</w:t>
+            </w:r>
+          </w:p>
+          <w:p>
+            <w:pPr>
+              <w:spacing w:after="50"/>
+              <w:ind w:left="300" w:hanging="300"/>
+            </w:pPr>
+            <w:r>
+              <w:rPr>
+                <w:rFonts w:ascii="Calibri" w:cs="Calibri" w:eastAsia="Calibri" w:hAnsi="Calibri"/>
+                <w:b/>
+                <w:bCs/>
+                <w:color w:val="7B4FBF"/>
+                <w:sz w:val="22"/>
+                <w:szCs w:val="22"/>
+              </w:rPr>
+              <w:t xml:space="preserve">✓  </w:t>
+            </w:r>
+            <w:r>
+              <w:rPr>
+                <w:rFonts w:ascii="Calibri" w:cs="Calibri" w:eastAsia="Calibri" w:hAnsi="Calibri"/>
+                <w:b/>
+                <w:bCs/>
+                <w:sz w:val="20"/>
+                <w:szCs w:val="20"/>
+              </w:rPr>
+              <w:t xml:space="preserve">Mentions légales, cookies, confidentialité</w:t>
+            </w:r>
+            <w:r>
+              <w:rPr>
+                <w:rFonts w:ascii="Calibri" w:cs="Calibri" w:eastAsia="Calibri" w:hAnsi="Calibri"/>
+                <w:sz w:val="20"/>
+                <w:szCs w:val="20"/>
+              </w:rPr>
+              <w:t xml:space="preserve"> du site</w:t>
+            </w:r>
+          </w:p>
+          <w:p>
+            <w:pPr>
+              <w:spacing w:after="50"/>
+              <w:ind w:left="300" w:hanging="300"/>
+            </w:pPr>
+            <w:r>
+              <w:rPr>
+                <w:rFonts w:ascii="Calibri" w:cs="Calibri" w:eastAsia="Calibri" w:hAnsi="Calibri"/>
+                <w:b/>
+                <w:bCs/>
+                <w:color w:val="7B4FBF"/>
+                <w:sz w:val="22"/>
+                <w:szCs w:val="22"/>
+              </w:rPr>
+              <w:t xml:space="preserve">✓  </w:t>
+            </w:r>
+            <w:r>
+              <w:rPr>
+                <w:rFonts w:ascii="Calibri" w:cs="Calibri" w:eastAsia="Calibri" w:hAnsi="Calibri"/>
+                <w:b/>
+                <w:bCs/>
+                <w:sz w:val="20"/>
+                <w:szCs w:val="20"/>
+              </w:rPr>
+              <w:t xml:space="preserve">Suivi mensuel et reporting</w:t>
+            </w:r>
+            <w:r>
+              <w:rPr>
+                <w:rFonts w:ascii="Calibri" w:cs="Calibri" w:eastAsia="Calibri" w:hAnsi="Calibri"/>
+                <w:sz w:val="20"/>
+                <w:szCs w:val="20"/>
+              </w:rPr>
+              <w:t xml:space="preserve"> : appels, avis, visites, ce qui marche</w:t>
+            </w:r>
+          </w:p>
+        </w:tc>
+      </w:tr>
+    </w:tbl>
+    <w:p>
+      <w:pPr>
+        <w:spacing w:after="80"/>
+      </w:pPr>
+    </w:p>
+    <w:tbl>
+      <w:tblPr>
+        <w:tblW w:type="dxa" w:w="9638"/>
+        <w:tblBorders>
+          <w:top w:val="single" w:color="auto" w:sz="4"/>
+          <w:left w:val="single" w:color="auto" w:sz="4"/>
+          <w:bottom w:val="single" w:color="auto" w:sz="4"/>
+          <w:right w:val="single" w:color="auto" w:sz="4"/>
+          <w:insideH w:val="single" w:color="auto" w:sz="4"/>
+          <w:insideV w:val="single" w:color="auto" w:sz="4"/>
+        </w:tblBorders>
+      </w:tblPr>
+      <w:tblGrid>
+        <w:gridCol w:w="4819"/>
+        <w:gridCol w:w="4819"/>
+      </w:tblGrid>
+      <w:tr>
+        <w:trPr>
+          <w:cantSplit/>
+        </w:trPr>
+        <w:tc>
+          <w:tcPr>
+            <w:tcW w:type="dxa" w:w="9638"/>
+            <w:gridSpan w:val="2"/>
+            <w:tcBorders>
+              <w:top w:val="single" w:color="E07A1F" w:sz="4"/>
+              <w:left w:val="single" w:color="E07A1F" w:sz="4"/>
+              <w:bottom w:val="single" w:color="E07A1F" w:sz="4"/>
+              <w:right w:val="single" w:color="E07A1F" w:sz="4"/>
+            </w:tcBorders>
+            <w:shd w:fill="E07A1F" w:color="auto" w:val="clear"/>
+            <w:tcMar>
+              <w:top w:type="dxa" w:w="90"/>
+              <w:left w:type="dxa" w:w="160"/>
+              <w:bottom w:type="dxa" w:w="90"/>
+              <w:right w:type="dxa" w:w="160"/>
+            </w:tcMar>
+          </w:tcPr>
+          <w:p>
+            <w:pPr>
+              <w:spacing w:after="20"/>
+            </w:pPr>
+            <w:r>
+              <w:rPr>
+                <w:rFonts w:ascii="Calibri" w:cs="Calibri" w:eastAsia="Calibri" w:hAnsi="Calibri"/>
+                <w:b/>
+                <w:bCs/>
+                <w:color w:val="FFFFFF"/>
+                <w:sz w:val="26"/>
+                <w:szCs w:val="26"/>
+              </w:rPr>
+              <w:t xml:space="preserve">Flocage, textile et impression</w:t>
+            </w:r>
+          </w:p>
+          <w:p>
+            <w:r>
+              <w:rPr>
+                <w:rFonts w:ascii="Calibri" w:cs="Calibri" w:eastAsia="Calibri" w:hAnsi="Calibri"/>
+                <w:i/>
+                <w:iCs/>
+                <w:color w:val="FFFFFF"/>
+                <w:sz w:val="19"/>
+                <w:szCs w:val="19"/>
+              </w:rPr>
+              <w:t xml:space="preserve">Des souvenirs et des supports soignés, produits par nos soins</w:t>
+            </w:r>
+          </w:p>
+        </w:tc>
+      </w:tr>
+      <w:tr>
+        <w:trPr>
+          <w:cantSplit/>
+        </w:trPr>
+        <w:tc>
+          <w:tcPr>
+            <w:tcW w:type="dxa" w:w="4819"/>
+            <w:tcBorders>
+              <w:top w:val="single" w:color="E07A1F" w:sz="4"/>
+              <w:left w:val="single" w:color="E07A1F" w:sz="4"/>
+              <w:bottom w:val="single" w:color="E07A1F" w:sz="4"/>
+              <w:right w:val="single" w:color="E07A1F" w:sz="4"/>
+            </w:tcBorders>
+            <w:shd w:fill="FAFAFA" w:color="auto" w:val="clear"/>
+            <w:tcMar>
+              <w:top w:type="dxa" w:w="90"/>
+              <w:left w:type="dxa" w:w="160"/>
+              <w:bottom w:type="dxa" w:w="60"/>
+              <w:right w:type="dxa" w:w="120"/>
+            </w:tcMar>
+          </w:tcPr>
+          <w:p>
+            <w:pPr>
+              <w:spacing w:after="50"/>
+              <w:ind w:left="300" w:hanging="300"/>
+            </w:pPr>
+            <w:r>
+              <w:rPr>
+                <w:rFonts w:ascii="Calibri" w:cs="Calibri" w:eastAsia="Calibri" w:hAnsi="Calibri"/>
+                <w:b/>
+                <w:bCs/>
+                <w:color w:val="E07A1F"/>
+                <w:sz w:val="22"/>
+                <w:szCs w:val="22"/>
+              </w:rPr>
+              <w:t xml:space="preserve">✓  </w:t>
+            </w:r>
+            <w:r>
+              <w:rPr>
+                <w:rFonts w:ascii="Calibri" w:cs="Calibri" w:eastAsia="Calibri" w:hAnsi="Calibri"/>
+                <w:b/>
+                <w:bCs/>
+                <w:sz w:val="20"/>
+                <w:szCs w:val="20"/>
+              </w:rPr>
+              <w:t xml:space="preserve">T-shirts et sweats hommage</w:t>
+            </w:r>
+            <w:r>
+              <w:rPr>
+                <w:rFonts w:ascii="Calibri" w:cs="Calibri" w:eastAsia="Calibri" w:hAnsi="Calibri"/>
+                <w:sz w:val="20"/>
+                <w:szCs w:val="20"/>
+              </w:rPr>
+              <w:t xml:space="preserve"> pour la famille et les proches</w:t>
+            </w:r>
+          </w:p>
+          <w:p>
+            <w:pPr>
+              <w:spacing w:after="50"/>
+              <w:ind w:left="300" w:hanging="300"/>
+            </w:pPr>
+            <w:r>
+              <w:rPr>
+                <w:rFonts w:ascii="Calibri" w:cs="Calibri" w:eastAsia="Calibri" w:hAnsi="Calibri"/>
+                <w:b/>
+                <w:bCs/>
+                <w:color w:val="E07A1F"/>
+                <w:sz w:val="22"/>
+                <w:szCs w:val="22"/>
+              </w:rPr>
+              <w:t xml:space="preserve">✓  </w:t>
+            </w:r>
+            <w:r>
+              <w:rPr>
+                <w:rFonts w:ascii="Calibri" w:cs="Calibri" w:eastAsia="Calibri" w:hAnsi="Calibri"/>
+                <w:b/>
+                <w:bCs/>
+                <w:sz w:val="20"/>
+                <w:szCs w:val="20"/>
+              </w:rPr>
+              <w:t xml:space="preserve">Vêtements de cérémonie</w:t>
+            </w:r>
+            <w:r>
+              <w:rPr>
+                <w:rFonts w:ascii="Calibri" w:cs="Calibri" w:eastAsia="Calibri" w:hAnsi="Calibri"/>
+                <w:sz w:val="20"/>
+                <w:szCs w:val="20"/>
+              </w:rPr>
+              <w:t xml:space="preserve"> et tenue de travail brandée discrète</w:t>
+            </w:r>
+          </w:p>
+          <w:p>
+            <w:pPr>
+              <w:spacing w:after="50"/>
+              <w:ind w:left="300" w:hanging="300"/>
+            </w:pPr>
+            <w:r>
+              <w:rPr>
+                <w:rFonts w:ascii="Calibri" w:cs="Calibri" w:eastAsia="Calibri" w:hAnsi="Calibri"/>
+                <w:b/>
+                <w:bCs/>
+                <w:color w:val="E07A1F"/>
+                <w:sz w:val="22"/>
+                <w:szCs w:val="22"/>
+              </w:rPr>
+              <w:t xml:space="preserve">✓  </w:t>
+            </w:r>
+            <w:r>
+              <w:rPr>
+                <w:rFonts w:ascii="Calibri" w:cs="Calibri" w:eastAsia="Calibri" w:hAnsi="Calibri"/>
+                <w:b/>
+                <w:bCs/>
+                <w:sz w:val="20"/>
+                <w:szCs w:val="20"/>
+              </w:rPr>
+              <w:t xml:space="preserve">Cartes souvenir, marque-pages, faire-part, remerciements</w:t>
+            </w:r>
+          </w:p>
+          <w:p>
+            <w:pPr>
+              <w:spacing w:after="50"/>
+              <w:ind w:left="300" w:hanging="300"/>
+            </w:pPr>
+            <w:r>
+              <w:rPr>
+                <w:rFonts w:ascii="Calibri" w:cs="Calibri" w:eastAsia="Calibri" w:hAnsi="Calibri"/>
+                <w:b/>
+                <w:bCs/>
+                <w:color w:val="E07A1F"/>
+                <w:sz w:val="22"/>
+                <w:szCs w:val="22"/>
+              </w:rPr>
+              <w:t xml:space="preserve">✓  </w:t>
+            </w:r>
+            <w:r>
+              <w:rPr>
+                <w:rFonts w:ascii="Calibri" w:cs="Calibri" w:eastAsia="Calibri" w:hAnsi="Calibri"/>
+                <w:b/>
+                <w:bCs/>
+                <w:sz w:val="20"/>
+                <w:szCs w:val="20"/>
+              </w:rPr>
+              <w:t xml:space="preserve">Livret de cérémonie</w:t>
+            </w:r>
+            <w:r>
+              <w:rPr>
+                <w:rFonts w:ascii="Calibri" w:cs="Calibri" w:eastAsia="Calibri" w:hAnsi="Calibri"/>
+                <w:sz w:val="20"/>
+                <w:szCs w:val="20"/>
+              </w:rPr>
+              <w:t xml:space="preserve"> : mise en page, photos, impression</w:t>
+            </w:r>
+          </w:p>
+        </w:tc>
+        <w:tc>
+          <w:tcPr>
+            <w:tcW w:type="dxa" w:w="4819"/>
+            <w:tcBorders>
+              <w:top w:val="single" w:color="E07A1F" w:sz="4"/>
+              <w:left w:val="single" w:color="E07A1F" w:sz="4"/>
+              <w:bottom w:val="single" w:color="E07A1F" w:sz="4"/>
+              <w:right w:val="single" w:color="E07A1F" w:sz="4"/>
+            </w:tcBorders>
+            <w:shd w:fill="FAFAFA" w:color="auto" w:val="clear"/>
+            <w:tcMar>
+              <w:top w:type="dxa" w:w="90"/>
+              <w:left w:type="dxa" w:w="160"/>
+              <w:bottom w:type="dxa" w:w="60"/>
+              <w:right w:type="dxa" w:w="120"/>
+            </w:tcMar>
+          </w:tcPr>
+          <w:p>
+            <w:pPr>
+              <w:spacing w:after="50"/>
+              <w:ind w:left="300" w:hanging="300"/>
+            </w:pPr>
+            <w:r>
+              <w:rPr>
+                <w:rFonts w:ascii="Calibri" w:cs="Calibri" w:eastAsia="Calibri" w:hAnsi="Calibri"/>
+                <w:b/>
+                <w:bCs/>
+                <w:color w:val="E07A1F"/>
+                <w:sz w:val="22"/>
+                <w:szCs w:val="22"/>
+              </w:rPr>
+              <w:t xml:space="preserve">✓  </w:t>
+            </w:r>
+            <w:r>
+              <w:rPr>
+                <w:rFonts w:ascii="Calibri" w:cs="Calibri" w:eastAsia="Calibri" w:hAnsi="Calibri"/>
+                <w:b/>
+                <w:bCs/>
+                <w:sz w:val="20"/>
+                <w:szCs w:val="20"/>
+              </w:rPr>
+              <w:t xml:space="preserve">Cartes de visite, plaquette, papier à en-tête</w:t>
+            </w:r>
+          </w:p>
+          <w:p>
+            <w:pPr>
+              <w:spacing w:after="50"/>
+              <w:ind w:left="300" w:hanging="300"/>
+            </w:pPr>
+            <w:r>
+              <w:rPr>
+                <w:rFonts w:ascii="Calibri" w:cs="Calibri" w:eastAsia="Calibri" w:hAnsi="Calibri"/>
+                <w:b/>
+                <w:bCs/>
+                <w:color w:val="E07A1F"/>
+                <w:sz w:val="22"/>
+                <w:szCs w:val="22"/>
+              </w:rPr>
+              <w:t xml:space="preserve">✓  </w:t>
+            </w:r>
+            <w:r>
+              <w:rPr>
+                <w:rFonts w:ascii="Calibri" w:cs="Calibri" w:eastAsia="Calibri" w:hAnsi="Calibri"/>
+                <w:b/>
+                <w:bCs/>
+                <w:sz w:val="20"/>
+                <w:szCs w:val="20"/>
+              </w:rPr>
+              <w:t xml:space="preserve">Dossier remis aux familles</w:t>
+            </w:r>
+            <w:r>
+              <w:rPr>
+                <w:rFonts w:ascii="Calibri" w:cs="Calibri" w:eastAsia="Calibri" w:hAnsi="Calibri"/>
+                <w:sz w:val="20"/>
+                <w:szCs w:val="20"/>
+              </w:rPr>
+              <w:t xml:space="preserve"> (pochette, fiches, frise des démarches)</w:t>
+            </w:r>
+          </w:p>
+          <w:p>
+            <w:pPr>
+              <w:spacing w:after="50"/>
+              <w:ind w:left="300" w:hanging="300"/>
+            </w:pPr>
+            <w:r>
+              <w:rPr>
+                <w:rFonts w:ascii="Calibri" w:cs="Calibri" w:eastAsia="Calibri" w:hAnsi="Calibri"/>
+                <w:b/>
+                <w:bCs/>
+                <w:color w:val="E07A1F"/>
+                <w:sz w:val="22"/>
+                <w:szCs w:val="22"/>
+              </w:rPr>
+              <w:t xml:space="preserve">✓  </w:t>
+            </w:r>
+            <w:r>
+              <w:rPr>
+                <w:rFonts w:ascii="Calibri" w:cs="Calibri" w:eastAsia="Calibri" w:hAnsi="Calibri"/>
+                <w:b/>
+                <w:bCs/>
+                <w:sz w:val="20"/>
+                <w:szCs w:val="20"/>
+              </w:rPr>
+              <w:t xml:space="preserve">Habillage du véhicule et signalétique</w:t>
+            </w:r>
+            <w:r>
+              <w:rPr>
+                <w:rFonts w:ascii="Calibri" w:cs="Calibri" w:eastAsia="Calibri" w:hAnsi="Calibri"/>
+                <w:sz w:val="20"/>
+                <w:szCs w:val="20"/>
+              </w:rPr>
+              <w:t xml:space="preserve"> du local</w:t>
+            </w:r>
+          </w:p>
+          <w:p>
+            <w:pPr>
+              <w:spacing w:after="50"/>
+              <w:ind w:left="300" w:hanging="300"/>
+            </w:pPr>
+            <w:r>
+              <w:rPr>
+                <w:rFonts w:ascii="Calibri" w:cs="Calibri" w:eastAsia="Calibri" w:hAnsi="Calibri"/>
+                <w:b/>
+                <w:bCs/>
+                <w:color w:val="E07A1F"/>
+                <w:sz w:val="22"/>
+                <w:szCs w:val="22"/>
+              </w:rPr>
+              <w:t xml:space="preserve">✓  </w:t>
+            </w:r>
+            <w:r>
+              <w:rPr>
+                <w:rFonts w:ascii="Calibri" w:cs="Calibri" w:eastAsia="Calibri" w:hAnsi="Calibri"/>
+                <w:b/>
+                <w:bCs/>
+                <w:sz w:val="20"/>
+                <w:szCs w:val="20"/>
+              </w:rPr>
+              <w:t xml:space="preserve">Objets personnalisés</w:t>
+            </w:r>
+            <w:r>
+              <w:rPr>
+                <w:rFonts w:ascii="Calibri" w:cs="Calibri" w:eastAsia="Calibri" w:hAnsi="Calibri"/>
+                <w:sz w:val="20"/>
+                <w:szCs w:val="20"/>
+              </w:rPr>
+              <w:t xml:space="preserve"> (gamme courte, sobre) avec bon à tirer validé</w:t>
+            </w:r>
+          </w:p>
+        </w:tc>
+      </w:tr>
+    </w:tbl>
+    <w:p>
+      <w:pPr>
+        <w:spacing w:after="80"/>
+      </w:pPr>
+    </w:p>
+    <w:tbl>
+      <w:tblPr>
+        <w:tblW w:type="dxa" w:w="9638"/>
+        <w:tblBorders>
+          <w:top w:val="single" w:color="auto" w:sz="4"/>
+          <w:left w:val="single" w:color="auto" w:sz="4"/>
+          <w:bottom w:val="single" w:color="auto" w:sz="4"/>
+          <w:right w:val="single" w:color="auto" w:sz="4"/>
+          <w:insideH w:val="single" w:color="auto" w:sz="4"/>
+          <w:insideV w:val="single" w:color="auto" w:sz="4"/>
+        </w:tblBorders>
+      </w:tblPr>
+      <w:tblGrid>
+        <w:gridCol w:w="4819"/>
+        <w:gridCol w:w="4819"/>
+      </w:tblGrid>
+      <w:tr>
+        <w:trPr>
+          <w:cantSplit/>
+        </w:trPr>
+        <w:tc>
+          <w:tcPr>
+            <w:tcW w:type="dxa" w:w="9638"/>
+            <w:gridSpan w:val="2"/>
+            <w:tcBorders>
+              <w:top w:val="single" w:color="1F7AE0" w:sz="4"/>
+              <w:left w:val="single" w:color="1F7AE0" w:sz="4"/>
+              <w:bottom w:val="single" w:color="1F7AE0" w:sz="4"/>
+              <w:right w:val="single" w:color="1F7AE0" w:sz="4"/>
+            </w:tcBorders>
+            <w:shd w:fill="1F7AE0" w:color="auto" w:val="clear"/>
+            <w:tcMar>
+              <w:top w:type="dxa" w:w="90"/>
+              <w:left w:type="dxa" w:w="160"/>
+              <w:bottom w:type="dxa" w:w="90"/>
+              <w:right w:type="dxa" w:w="160"/>
+            </w:tcMar>
+          </w:tcPr>
+          <w:p>
+            <w:pPr>
+              <w:spacing w:after="20"/>
+            </w:pPr>
+            <w:r>
+              <w:rPr>
+                <w:rFonts w:ascii="Calibri" w:cs="Calibri" w:eastAsia="Calibri" w:hAnsi="Calibri"/>
+                <w:b/>
+                <w:bCs/>
+                <w:color w:val="FFFFFF"/>
+                <w:sz w:val="26"/>
+                <w:szCs w:val="26"/>
+              </w:rPr>
+              <w:t xml:space="preserve">Conseil et stratégie</w:t>
+            </w:r>
+          </w:p>
+          <w:p>
+            <w:r>
+              <w:rPr>
+                <w:rFonts w:ascii="Calibri" w:cs="Calibri" w:eastAsia="Calibri" w:hAnsi="Calibri"/>
+                <w:i/>
+                <w:iCs/>
+                <w:color w:val="FFFFFF"/>
+                <w:sz w:val="19"/>
+                <w:szCs w:val="19"/>
+              </w:rPr>
+              <w:t xml:space="preserve">Poser les bonnes bases avant de se lancer</w:t>
+            </w:r>
+          </w:p>
+        </w:tc>
+      </w:tr>
+      <w:tr>
+        <w:trPr>
+          <w:cantSplit/>
+        </w:trPr>
+        <w:tc>
+          <w:tcPr>
+            <w:tcW w:type="dxa" w:w="4819"/>
+            <w:tcBorders>
+              <w:top w:val="single" w:color="1F7AE0" w:sz="4"/>
+              <w:left w:val="single" w:color="1F7AE0" w:sz="4"/>
+              <w:bottom w:val="single" w:color="1F7AE0" w:sz="4"/>
+              <w:right w:val="single" w:color="1F7AE0" w:sz="4"/>
+            </w:tcBorders>
+            <w:shd w:fill="FAFAFA" w:color="auto" w:val="clear"/>
+            <w:tcMar>
+              <w:top w:type="dxa" w:w="90"/>
+              <w:left w:type="dxa" w:w="160"/>
+              <w:bottom w:type="dxa" w:w="60"/>
+              <w:right w:type="dxa" w:w="120"/>
+            </w:tcMar>
+          </w:tcPr>
+          <w:p>
+            <w:pPr>
+              <w:spacing w:after="50"/>
+              <w:ind w:left="300" w:hanging="300"/>
+            </w:pPr>
+            <w:r>
+              <w:rPr>
+                <w:rFonts w:ascii="Calibri" w:cs="Calibri" w:eastAsia="Calibri" w:hAnsi="Calibri"/>
+                <w:b/>
+                <w:bCs/>
+                <w:color w:val="1F7AE0"/>
+                <w:sz w:val="22"/>
+                <w:szCs w:val="22"/>
+              </w:rPr>
+              <w:t xml:space="preserve">✓  </w:t>
+            </w:r>
+            <w:r>
+              <w:rPr>
+                <w:rFonts w:ascii="Calibri" w:cs="Calibri" w:eastAsia="Calibri" w:hAnsi="Calibri"/>
+                <w:b/>
+                <w:bCs/>
+                <w:sz w:val="20"/>
+                <w:szCs w:val="20"/>
+              </w:rPr>
+              <w:t xml:space="preserve">Nom, positionnement et charte</w:t>
+            </w:r>
+            <w:r>
+              <w:rPr>
+                <w:rFonts w:ascii="Calibri" w:cs="Calibri" w:eastAsia="Calibri" w:hAnsi="Calibri"/>
+                <w:sz w:val="20"/>
+                <w:szCs w:val="20"/>
+              </w:rPr>
+              <w:t xml:space="preserve"> de la marque</w:t>
+            </w:r>
+          </w:p>
+          <w:p>
+            <w:pPr>
+              <w:spacing w:after="50"/>
+              <w:ind w:left="300" w:hanging="300"/>
+            </w:pPr>
+            <w:r>
+              <w:rPr>
+                <w:rFonts w:ascii="Calibri" w:cs="Calibri" w:eastAsia="Calibri" w:hAnsi="Calibri"/>
+                <w:b/>
+                <w:bCs/>
+                <w:color w:val="1F7AE0"/>
+                <w:sz w:val="22"/>
+                <w:szCs w:val="22"/>
+              </w:rPr>
+              <w:t xml:space="preserve">✓  </w:t>
+            </w:r>
+            <w:r>
+              <w:rPr>
+                <w:rFonts w:ascii="Calibri" w:cs="Calibri" w:eastAsia="Calibri" w:hAnsi="Calibri"/>
+                <w:b/>
+                <w:bCs/>
+                <w:sz w:val="20"/>
+                <w:szCs w:val="20"/>
+              </w:rPr>
+              <w:t xml:space="preserve">Étude locale</w:t>
+            </w:r>
+            <w:r>
+              <w:rPr>
+                <w:rFonts w:ascii="Calibri" w:cs="Calibri" w:eastAsia="Calibri" w:hAnsi="Calibri"/>
+                <w:sz w:val="20"/>
+                <w:szCs w:val="20"/>
+              </w:rPr>
+              <w:t xml:space="preserve"> : concurrents, mots-clés, partenaires (Annexe K)</w:t>
+            </w:r>
+          </w:p>
+          <w:p>
+            <w:pPr>
+              <w:spacing w:after="50"/>
+              <w:ind w:left="300" w:hanging="300"/>
+            </w:pPr>
+            <w:r>
+              <w:rPr>
+                <w:rFonts w:ascii="Calibri" w:cs="Calibri" w:eastAsia="Calibri" w:hAnsi="Calibri"/>
+                <w:b/>
+                <w:bCs/>
+                <w:color w:val="1F7AE0"/>
+                <w:sz w:val="22"/>
+                <w:szCs w:val="22"/>
+              </w:rPr>
+              <w:t xml:space="preserve">✓  </w:t>
+            </w:r>
+            <w:r>
+              <w:rPr>
+                <w:rFonts w:ascii="Calibri" w:cs="Calibri" w:eastAsia="Calibri" w:hAnsi="Calibri"/>
+                <w:b/>
+                <w:bCs/>
+                <w:sz w:val="20"/>
+                <w:szCs w:val="20"/>
+              </w:rPr>
+              <w:t xml:space="preserve">Parcours d’accueil des familles</w:t>
+            </w:r>
+            <w:r>
+              <w:rPr>
+                <w:rFonts w:ascii="Calibri" w:cs="Calibri" w:eastAsia="Calibri" w:hAnsi="Calibri"/>
+                <w:sz w:val="20"/>
+                <w:szCs w:val="20"/>
+              </w:rPr>
+              <w:t xml:space="preserve"> : de l’appel au suivi</w:t>
+            </w:r>
+          </w:p>
+          <w:p>
+            <w:pPr>
+              <w:spacing w:after="50"/>
+              <w:ind w:left="300" w:hanging="300"/>
+            </w:pPr>
+            <w:r>
+              <w:rPr>
+                <w:rFonts w:ascii="Calibri" w:cs="Calibri" w:eastAsia="Calibri" w:hAnsi="Calibri"/>
+                <w:b/>
+                <w:bCs/>
+                <w:color w:val="1F7AE0"/>
+                <w:sz w:val="22"/>
+                <w:szCs w:val="22"/>
+              </w:rPr>
+              <w:t xml:space="preserve">✓  </w:t>
+            </w:r>
+            <w:r>
+              <w:rPr>
+                <w:rFonts w:ascii="Calibri" w:cs="Calibri" w:eastAsia="Calibri" w:hAnsi="Calibri"/>
+                <w:b/>
+                <w:bCs/>
+                <w:sz w:val="20"/>
+                <w:szCs w:val="20"/>
+              </w:rPr>
+              <w:t xml:space="preserve">Outils de vente légers</w:t>
+            </w:r>
+            <w:r>
+              <w:rPr>
+                <w:rFonts w:ascii="Calibri" w:cs="Calibri" w:eastAsia="Calibri" w:hAnsi="Calibri"/>
+                <w:sz w:val="20"/>
+                <w:szCs w:val="20"/>
+              </w:rPr>
+              <w:t xml:space="preserve"> : CRM simple, suivi des dossiers</w:t>
+            </w:r>
+          </w:p>
+        </w:tc>
+        <w:tc>
+          <w:tcPr>
+            <w:tcW w:type="dxa" w:w="4819"/>
+            <w:tcBorders>
+              <w:top w:val="single" w:color="1F7AE0" w:sz="4"/>
+              <w:left w:val="single" w:color="1F7AE0" w:sz="4"/>
+              <w:bottom w:val="single" w:color="1F7AE0" w:sz="4"/>
+              <w:right w:val="single" w:color="1F7AE0" w:sz="4"/>
+            </w:tcBorders>
+            <w:shd w:fill="FAFAFA" w:color="auto" w:val="clear"/>
+            <w:tcMar>
+              <w:top w:type="dxa" w:w="90"/>
+              <w:left w:type="dxa" w:w="160"/>
+              <w:bottom w:type="dxa" w:w="60"/>
+              <w:right w:type="dxa" w:w="120"/>
+            </w:tcMar>
+          </w:tcPr>
+          <w:p>
+            <w:pPr>
+              <w:spacing w:after="50"/>
+              <w:ind w:left="300" w:hanging="300"/>
+            </w:pPr>
+            <w:r>
+              <w:rPr>
+                <w:rFonts w:ascii="Calibri" w:cs="Calibri" w:eastAsia="Calibri" w:hAnsi="Calibri"/>
+                <w:b/>
+                <w:bCs/>
+                <w:color w:val="1F7AE0"/>
+                <w:sz w:val="22"/>
+                <w:szCs w:val="22"/>
+              </w:rPr>
+              <w:t xml:space="preserve">✓  </w:t>
+            </w:r>
+            <w:r>
+              <w:rPr>
+                <w:rFonts w:ascii="Calibri" w:cs="Calibri" w:eastAsia="Calibri" w:hAnsi="Calibri"/>
+                <w:b/>
+                <w:bCs/>
+                <w:sz w:val="20"/>
+                <w:szCs w:val="20"/>
+              </w:rPr>
+              <w:t xml:space="preserve">Stratégie de partenariats</w:t>
+            </w:r>
+            <w:r>
+              <w:rPr>
+                <w:rFonts w:ascii="Calibri" w:cs="Calibri" w:eastAsia="Calibri" w:hAnsi="Calibri"/>
+                <w:sz w:val="20"/>
+                <w:szCs w:val="20"/>
+              </w:rPr>
+              <w:t xml:space="preserve"> respectueuse de la loi</w:t>
+            </w:r>
+          </w:p>
+          <w:p>
+            <w:pPr>
+              <w:spacing w:after="50"/>
+              <w:ind w:left="300" w:hanging="300"/>
+            </w:pPr>
+            <w:r>
+              <w:rPr>
+                <w:rFonts w:ascii="Calibri" w:cs="Calibri" w:eastAsia="Calibri" w:hAnsi="Calibri"/>
+                <w:b/>
+                <w:bCs/>
+                <w:color w:val="1F7AE0"/>
+                <w:sz w:val="22"/>
+                <w:szCs w:val="22"/>
+              </w:rPr>
+              <w:t xml:space="preserve">✓  </w:t>
+            </w:r>
+            <w:r>
+              <w:rPr>
+                <w:rFonts w:ascii="Calibri" w:cs="Calibri" w:eastAsia="Calibri" w:hAnsi="Calibri"/>
+                <w:b/>
+                <w:bCs/>
+                <w:sz w:val="20"/>
+                <w:szCs w:val="20"/>
+              </w:rPr>
+              <w:t xml:space="preserve">Relecture de la communication</w:t>
+            </w:r>
+            <w:r>
+              <w:rPr>
+                <w:rFonts w:ascii="Calibri" w:cs="Calibri" w:eastAsia="Calibri" w:hAnsi="Calibri"/>
+                <w:sz w:val="20"/>
+                <w:szCs w:val="20"/>
+              </w:rPr>
+              <w:t xml:space="preserve"> avec un juriste (démarchage)</w:t>
+            </w:r>
+          </w:p>
+          <w:p>
+            <w:pPr>
+              <w:spacing w:after="50"/>
+              <w:ind w:left="300" w:hanging="300"/>
+            </w:pPr>
+            <w:r>
+              <w:rPr>
+                <w:rFonts w:ascii="Calibri" w:cs="Calibri" w:eastAsia="Calibri" w:hAnsi="Calibri"/>
+                <w:b/>
+                <w:bCs/>
+                <w:color w:val="1F7AE0"/>
+                <w:sz w:val="22"/>
+                <w:szCs w:val="22"/>
+              </w:rPr>
+              <w:t xml:space="preserve">✓  </w:t>
+            </w:r>
+            <w:r>
+              <w:rPr>
+                <w:rFonts w:ascii="Calibri" w:cs="Calibri" w:eastAsia="Calibri" w:hAnsi="Calibri"/>
+                <w:b/>
+                <w:bCs/>
+                <w:sz w:val="20"/>
+                <w:szCs w:val="20"/>
+              </w:rPr>
+              <w:t xml:space="preserve">Plan de lancement et budget communication</w:t>
+            </w:r>
+            <w:r>
+              <w:rPr>
+                <w:rFonts w:ascii="Calibri" w:cs="Calibri" w:eastAsia="Calibri" w:hAnsi="Calibri"/>
+                <w:sz w:val="20"/>
+                <w:szCs w:val="20"/>
+              </w:rPr>
+              <w:t xml:space="preserve"> sur 12 mois</w:t>
+            </w:r>
+          </w:p>
+          <w:p>
+            <w:pPr>
+              <w:spacing w:after="50"/>
+              <w:ind w:left="300" w:hanging="300"/>
+            </w:pPr>
+            <w:r>
+              <w:rPr>
+                <w:rFonts w:ascii="Calibri" w:cs="Calibri" w:eastAsia="Calibri" w:hAnsi="Calibri"/>
+                <w:b/>
+                <w:bCs/>
+                <w:color w:val="1F7AE0"/>
+                <w:sz w:val="22"/>
+                <w:szCs w:val="22"/>
+              </w:rPr>
+              <w:t xml:space="preserve">✓  </w:t>
+            </w:r>
+            <w:r>
+              <w:rPr>
+                <w:rFonts w:ascii="Calibri" w:cs="Calibri" w:eastAsia="Calibri" w:hAnsi="Calibri"/>
+                <w:b/>
+                <w:bCs/>
+                <w:sz w:val="20"/>
+                <w:szCs w:val="20"/>
+              </w:rPr>
+              <w:t xml:space="preserve">Tableau de bord</w:t>
+            </w:r>
+            <w:r>
+              <w:rPr>
+                <w:rFonts w:ascii="Calibri" w:cs="Calibri" w:eastAsia="Calibri" w:hAnsi="Calibri"/>
+                <w:sz w:val="20"/>
+                <w:szCs w:val="20"/>
+              </w:rPr>
+              <w:t xml:space="preserve"> : indicateurs simples à suivre chaque mois</w:t>
+            </w:r>
+          </w:p>
+        </w:tc>
+      </w:tr>
+    </w:tbl>
+    <w:p>
+      <w:r>
+        <w:br w:type="page"/>
+      </w:r>
+    </w:p>
+    <w:tbl>
+      <w:tblPr>
+        <w:tblW w:type="dxa" w:w="9638"/>
+        <w:tblBorders>
+          <w:top w:val="single" w:color="auto" w:sz="4"/>
+          <w:left w:val="single" w:color="auto" w:sz="4"/>
+          <w:bottom w:val="single" w:color="auto" w:sz="4"/>
+          <w:right w:val="single" w:color="auto" w:sz="4"/>
+          <w:insideH w:val="single" w:color="auto" w:sz="4"/>
+          <w:insideV w:val="single" w:color="auto" w:sz="4"/>
+        </w:tblBorders>
+      </w:tblPr>
+      <w:tblGrid>
+        <w:gridCol w:w="4819"/>
+        <w:gridCol w:w="4819"/>
+      </w:tblGrid>
+      <w:tr>
+        <w:trPr>
+          <w:cantSplit/>
+        </w:trPr>
+        <w:tc>
+          <w:tcPr>
+            <w:tcW w:type="dxa" w:w="9638"/>
+            <w:gridSpan w:val="2"/>
+            <w:tcBorders>
+              <w:top w:val="single" w:color="0E9488" w:sz="4"/>
+              <w:left w:val="single" w:color="0E9488" w:sz="4"/>
+              <w:bottom w:val="single" w:color="0E9488" w:sz="4"/>
+              <w:right w:val="single" w:color="0E9488" w:sz="4"/>
+            </w:tcBorders>
+            <w:shd w:fill="0E9488" w:color="auto" w:val="clear"/>
+            <w:tcMar>
+              <w:top w:type="dxa" w:w="90"/>
+              <w:left w:type="dxa" w:w="160"/>
+              <w:bottom w:type="dxa" w:w="90"/>
+              <w:right w:type="dxa" w:w="160"/>
+            </w:tcMar>
+          </w:tcPr>
+          <w:p>
+            <w:pPr>
+              <w:spacing w:after="20"/>
+            </w:pPr>
+            <w:r>
+              <w:rPr>
+                <w:rFonts w:ascii="Calibri" w:cs="Calibri" w:eastAsia="Calibri" w:hAnsi="Calibri"/>
+                <w:b/>
+                <w:bCs/>
+                <w:color w:val="FFFFFF"/>
+                <w:sz w:val="26"/>
+                <w:szCs w:val="26"/>
+              </w:rPr>
+              <w:t xml:space="preserve">Rédaction et contenus</w:t>
+            </w:r>
+          </w:p>
+          <w:p>
+            <w:r>
+              <w:rPr>
+                <w:rFonts w:ascii="Calibri" w:cs="Calibri" w:eastAsia="Calibri" w:hAnsi="Calibri"/>
+                <w:i/>
+                <w:iCs/>
+                <w:color w:val="FFFFFF"/>
+                <w:sz w:val="19"/>
+                <w:szCs w:val="19"/>
+              </w:rPr>
+              <w:t xml:space="preserve">Les mots justes, avec la bonne tonalité</w:t>
+            </w:r>
+          </w:p>
+        </w:tc>
+      </w:tr>
+      <w:tr>
+        <w:trPr>
+          <w:cantSplit/>
+        </w:trPr>
+        <w:tc>
+          <w:tcPr>
+            <w:tcW w:type="dxa" w:w="4819"/>
+            <w:tcBorders>
+              <w:top w:val="single" w:color="0E9488" w:sz="4"/>
+              <w:left w:val="single" w:color="0E9488" w:sz="4"/>
+              <w:bottom w:val="single" w:color="0E9488" w:sz="4"/>
+              <w:right w:val="single" w:color="0E9488" w:sz="4"/>
+            </w:tcBorders>
+            <w:shd w:fill="FAFAFA" w:color="auto" w:val="clear"/>
+            <w:tcMar>
+              <w:top w:type="dxa" w:w="90"/>
+              <w:left w:type="dxa" w:w="160"/>
+              <w:bottom w:type="dxa" w:w="60"/>
+              <w:right w:type="dxa" w:w="120"/>
+            </w:tcMar>
+          </w:tcPr>
+          <w:p>
+            <w:pPr>
+              <w:spacing w:after="50"/>
+              <w:ind w:left="300" w:hanging="300"/>
+            </w:pPr>
+            <w:r>
+              <w:rPr>
+                <w:rFonts w:ascii="Calibri" w:cs="Calibri" w:eastAsia="Calibri" w:hAnsi="Calibri"/>
+                <w:b/>
+                <w:bCs/>
+                <w:color w:val="0E9488"/>
+                <w:sz w:val="22"/>
+                <w:szCs w:val="22"/>
+              </w:rPr>
+              <w:t xml:space="preserve">✓  </w:t>
+            </w:r>
+            <w:r>
+              <w:rPr>
+                <w:rFonts w:ascii="Calibri" w:cs="Calibri" w:eastAsia="Calibri" w:hAnsi="Calibri"/>
+                <w:b/>
+                <w:bCs/>
+                <w:sz w:val="20"/>
+                <w:szCs w:val="20"/>
+              </w:rPr>
+              <w:t xml:space="preserve">Guide « Que faire après un décès ? »</w:t>
+            </w:r>
+            <w:r>
+              <w:rPr>
+                <w:rFonts w:ascii="Calibri" w:cs="Calibri" w:eastAsia="Calibri" w:hAnsi="Calibri"/>
+                <w:sz w:val="20"/>
+                <w:szCs w:val="20"/>
+              </w:rPr>
+              <w:t xml:space="preserve"> (site + livret imprimé)</w:t>
+            </w:r>
+          </w:p>
+          <w:p>
+            <w:pPr>
+              <w:spacing w:after="50"/>
+              <w:ind w:left="300" w:hanging="300"/>
+            </w:pPr>
+            <w:r>
+              <w:rPr>
+                <w:rFonts w:ascii="Calibri" w:cs="Calibri" w:eastAsia="Calibri" w:hAnsi="Calibri"/>
+                <w:b/>
+                <w:bCs/>
+                <w:color w:val="0E9488"/>
+                <w:sz w:val="22"/>
+                <w:szCs w:val="22"/>
+              </w:rPr>
+              <w:t xml:space="preserve">✓  </w:t>
+            </w:r>
+            <w:r>
+              <w:rPr>
+                <w:rFonts w:ascii="Calibri" w:cs="Calibri" w:eastAsia="Calibri" w:hAnsi="Calibri"/>
+                <w:b/>
+                <w:bCs/>
+                <w:sz w:val="20"/>
+                <w:szCs w:val="20"/>
+              </w:rPr>
+              <w:t xml:space="preserve">FAQ</w:t>
+            </w:r>
+            <w:r>
+              <w:rPr>
+                <w:rFonts w:ascii="Calibri" w:cs="Calibri" w:eastAsia="Calibri" w:hAnsi="Calibri"/>
+                <w:sz w:val="20"/>
+                <w:szCs w:val="20"/>
+              </w:rPr>
+              <w:t xml:space="preserve">, textes du site et de la fiche Google</w:t>
+            </w:r>
+          </w:p>
+          <w:p>
+            <w:pPr>
+              <w:spacing w:after="50"/>
+              <w:ind w:left="300" w:hanging="300"/>
+            </w:pPr>
+            <w:r>
+              <w:rPr>
+                <w:rFonts w:ascii="Calibri" w:cs="Calibri" w:eastAsia="Calibri" w:hAnsi="Calibri"/>
+                <w:b/>
+                <w:bCs/>
+                <w:color w:val="0E9488"/>
+                <w:sz w:val="22"/>
+                <w:szCs w:val="22"/>
+              </w:rPr>
+              <w:t xml:space="preserve">✓  </w:t>
+            </w:r>
+            <w:r>
+              <w:rPr>
+                <w:rFonts w:ascii="Calibri" w:cs="Calibri" w:eastAsia="Calibri" w:hAnsi="Calibri"/>
+                <w:b/>
+                <w:bCs/>
+                <w:sz w:val="20"/>
+                <w:szCs w:val="20"/>
+              </w:rPr>
+              <w:t xml:space="preserve">Scripts</w:t>
+            </w:r>
+            <w:r>
+              <w:rPr>
+                <w:rFonts w:ascii="Calibri" w:cs="Calibri" w:eastAsia="Calibri" w:hAnsi="Calibri"/>
+                <w:sz w:val="20"/>
+                <w:szCs w:val="20"/>
+              </w:rPr>
+              <w:t xml:space="preserve"> d’accueil téléphonique et de suivi</w:t>
+            </w:r>
+          </w:p>
+          <w:p>
+            <w:pPr>
+              <w:spacing w:after="50"/>
+              <w:ind w:left="300" w:hanging="300"/>
+            </w:pPr>
+            <w:r>
+              <w:rPr>
+                <w:rFonts w:ascii="Calibri" w:cs="Calibri" w:eastAsia="Calibri" w:hAnsi="Calibri"/>
+                <w:b/>
+                <w:bCs/>
+                <w:color w:val="0E9488"/>
+                <w:sz w:val="22"/>
+                <w:szCs w:val="22"/>
+              </w:rPr>
+              <w:t xml:space="preserve">✓  </w:t>
+            </w:r>
+            <w:r>
+              <w:rPr>
+                <w:rFonts w:ascii="Calibri" w:cs="Calibri" w:eastAsia="Calibri" w:hAnsi="Calibri"/>
+                <w:b/>
+                <w:bCs/>
+                <w:sz w:val="20"/>
+                <w:szCs w:val="20"/>
+              </w:rPr>
+              <w:t xml:space="preserve">Modèles</w:t>
+            </w:r>
+            <w:r>
+              <w:rPr>
+                <w:rFonts w:ascii="Calibri" w:cs="Calibri" w:eastAsia="Calibri" w:hAnsi="Calibri"/>
+                <w:sz w:val="20"/>
+                <w:szCs w:val="20"/>
+              </w:rPr>
+              <w:t xml:space="preserve"> de devis, mandat, récapitulatif, avis (à valider par un juriste)</w:t>
+            </w:r>
+          </w:p>
+        </w:tc>
+        <w:tc>
+          <w:tcPr>
+            <w:tcW w:type="dxa" w:w="4819"/>
+            <w:tcBorders>
+              <w:top w:val="single" w:color="0E9488" w:sz="4"/>
+              <w:left w:val="single" w:color="0E9488" w:sz="4"/>
+              <w:bottom w:val="single" w:color="0E9488" w:sz="4"/>
+              <w:right w:val="single" w:color="0E9488" w:sz="4"/>
+            </w:tcBorders>
+            <w:shd w:fill="FAFAFA" w:color="auto" w:val="clear"/>
+            <w:tcMar>
+              <w:top w:type="dxa" w:w="90"/>
+              <w:left w:type="dxa" w:w="160"/>
+              <w:bottom w:type="dxa" w:w="60"/>
+              <w:right w:type="dxa" w:w="120"/>
+            </w:tcMar>
+          </w:tcPr>
+          <w:p>
+            <w:pPr>
+              <w:spacing w:after="50"/>
+              <w:ind w:left="300" w:hanging="300"/>
+            </w:pPr>
+            <w:r>
+              <w:rPr>
+                <w:rFonts w:ascii="Calibri" w:cs="Calibri" w:eastAsia="Calibri" w:hAnsi="Calibri"/>
+                <w:b/>
+                <w:bCs/>
+                <w:color w:val="0E9488"/>
+                <w:sz w:val="22"/>
+                <w:szCs w:val="22"/>
+              </w:rPr>
+              <w:t xml:space="preserve">✓  </w:t>
+            </w:r>
+            <w:r>
+              <w:rPr>
+                <w:rFonts w:ascii="Calibri" w:cs="Calibri" w:eastAsia="Calibri" w:hAnsi="Calibri"/>
+                <w:b/>
+                <w:bCs/>
+                <w:sz w:val="20"/>
+                <w:szCs w:val="20"/>
+              </w:rPr>
+              <w:t xml:space="preserve">Articles de blog</w:t>
+            </w:r>
+            <w:r>
+              <w:rPr>
+                <w:rFonts w:ascii="Calibri" w:cs="Calibri" w:eastAsia="Calibri" w:hAnsi="Calibri"/>
+                <w:sz w:val="20"/>
+                <w:szCs w:val="20"/>
+              </w:rPr>
+              <w:t xml:space="preserve"> et publications pédagogiques</w:t>
+            </w:r>
+          </w:p>
+          <w:p>
+            <w:pPr>
+              <w:spacing w:after="50"/>
+              <w:ind w:left="300" w:hanging="300"/>
+            </w:pPr>
+            <w:r>
+              <w:rPr>
+                <w:rFonts w:ascii="Calibri" w:cs="Calibri" w:eastAsia="Calibri" w:hAnsi="Calibri"/>
+                <w:b/>
+                <w:bCs/>
+                <w:color w:val="0E9488"/>
+                <w:sz w:val="22"/>
+                <w:szCs w:val="22"/>
+              </w:rPr>
+              <w:t xml:space="preserve">✓  </w:t>
+            </w:r>
+            <w:r>
+              <w:rPr>
+                <w:rFonts w:ascii="Calibri" w:cs="Calibri" w:eastAsia="Calibri" w:hAnsi="Calibri"/>
+                <w:b/>
+                <w:bCs/>
+                <w:sz w:val="20"/>
+                <w:szCs w:val="20"/>
+              </w:rPr>
+              <w:t xml:space="preserve">Messages sensibles</w:t>
+            </w:r>
+            <w:r>
+              <w:rPr>
+                <w:rFonts w:ascii="Calibri" w:cs="Calibri" w:eastAsia="Calibri" w:hAnsi="Calibri"/>
+                <w:sz w:val="20"/>
+                <w:szCs w:val="20"/>
+              </w:rPr>
+              <w:t xml:space="preserve"> : réponses aux avis, dates difficiles, Toussaint</w:t>
+            </w:r>
+          </w:p>
+          <w:p>
+            <w:pPr>
+              <w:spacing w:after="50"/>
+              <w:ind w:left="300" w:hanging="300"/>
+            </w:pPr>
+            <w:r>
+              <w:rPr>
+                <w:rFonts w:ascii="Calibri" w:cs="Calibri" w:eastAsia="Calibri" w:hAnsi="Calibri"/>
+                <w:b/>
+                <w:bCs/>
+                <w:color w:val="0E9488"/>
+                <w:sz w:val="22"/>
+                <w:szCs w:val="22"/>
+              </w:rPr>
+              <w:t xml:space="preserve">✓  </w:t>
+            </w:r>
+            <w:r>
+              <w:rPr>
+                <w:rFonts w:ascii="Calibri" w:cs="Calibri" w:eastAsia="Calibri" w:hAnsi="Calibri"/>
+                <w:b/>
+                <w:bCs/>
+                <w:sz w:val="20"/>
+                <w:szCs w:val="20"/>
+              </w:rPr>
+              <w:t xml:space="preserve">Newsletter</w:t>
+            </w:r>
+            <w:r>
+              <w:rPr>
+                <w:rFonts w:ascii="Calibri" w:cs="Calibri" w:eastAsia="Calibri" w:hAnsi="Calibri"/>
+                <w:sz w:val="20"/>
+                <w:szCs w:val="20"/>
+              </w:rPr>
+              <w:t xml:space="preserve"> d’information (uniquement avec consentement)</w:t>
+            </w:r>
+          </w:p>
+          <w:p>
+            <w:pPr>
+              <w:spacing w:after="50"/>
+              <w:ind w:left="300" w:hanging="300"/>
+            </w:pPr>
+            <w:r>
+              <w:rPr>
+                <w:rFonts w:ascii="Calibri" w:cs="Calibri" w:eastAsia="Calibri" w:hAnsi="Calibri"/>
+                <w:b/>
+                <w:bCs/>
+                <w:color w:val="0E9488"/>
+                <w:sz w:val="22"/>
+                <w:szCs w:val="22"/>
+              </w:rPr>
+              <w:t xml:space="preserve">✓  </w:t>
+            </w:r>
+            <w:r>
+              <w:rPr>
+                <w:rFonts w:ascii="Calibri" w:cs="Calibri" w:eastAsia="Calibri" w:hAnsi="Calibri"/>
+                <w:b/>
+                <w:bCs/>
+                <w:sz w:val="20"/>
+                <w:szCs w:val="20"/>
+              </w:rPr>
+              <w:t xml:space="preserve">Présentation</w:t>
+            </w:r>
+            <w:r>
+              <w:rPr>
+                <w:rFonts w:ascii="Calibri" w:cs="Calibri" w:eastAsia="Calibri" w:hAnsi="Calibri"/>
+                <w:sz w:val="20"/>
+                <w:szCs w:val="20"/>
+              </w:rPr>
+              <w:t xml:space="preserve"> pour les partenaires (notaires, psychologues…)</w:t>
+            </w:r>
+          </w:p>
+        </w:tc>
+      </w:tr>
+    </w:tbl>
+    <w:p>
+      <w:pPr>
+        <w:spacing w:after="80"/>
+      </w:pPr>
+    </w:p>
+    <w:p>
+      <w:pPr>
+        <w:pStyle w:val="Heading2"/>
+        <w:keepNext/>
+        <w:spacing w:after="120" w:before="280"/>
+      </w:pPr>
+      <w:r>
+        <w:rPr>
+          <w:rFonts w:ascii="Calibri" w:cs="Calibri" w:eastAsia="Calibri" w:hAnsi="Calibri"/>
+          <w:b/>
+          <w:bCs/>
+          <w:color w:val="5B7F6B"/>
+          <w:sz w:val="28"/>
+          <w:szCs w:val="28"/>
+        </w:rPr>
+        <w:t xml:space="preserve">Quand intervenons-nous ? (calendrier type)</w:t>
+      </w:r>
+    </w:p>
+    <w:tbl>
+      <w:tblPr>
+        <w:tblW w:type="dxa" w:w="9638"/>
+        <w:tblBorders>
+          <w:top w:val="single" w:color="auto" w:sz="4"/>
+          <w:left w:val="single" w:color="auto" w:sz="4"/>
+          <w:bottom w:val="single" w:color="auto" w:sz="4"/>
+          <w:right w:val="single" w:color="auto" w:sz="4"/>
+          <w:insideH w:val="single" w:color="auto" w:sz="4"/>
+          <w:insideV w:val="single" w:color="auto" w:sz="4"/>
+        </w:tblBorders>
+      </w:tblPr>
+      <w:tblGrid>
+        <w:gridCol w:w="1900"/>
+        <w:gridCol w:w="7738"/>
+      </w:tblGrid>
+      <w:tr>
+        <w:trPr>
+          <w:cantSplit/>
+          <w:tblHeader/>
+        </w:trPr>
+        <w:tc>
+          <w:tcPr>
+            <w:tcW w:type="dxa" w:w="1900"/>
+            <w:tcBorders>
+              <w:top w:val="single" w:color="C9D3CD" w:sz="4"/>
+              <w:left w:val="single" w:color="C9D3CD" w:sz="4"/>
+              <w:bottom w:val="single" w:color="C9D3CD" w:sz="4"/>
+              <w:right w:val="single" w:color="C9D3CD" w:sz="4"/>
+            </w:tcBorders>
+            <w:shd w:fill="1F3A5F" w:color="auto" w:val="clear"/>
+            <w:tcMar>
+              <w:top w:type="dxa" w:w="70"/>
+              <w:left w:type="dxa" w:w="110"/>
+              <w:bottom w:type="dxa" w:w="70"/>
+              <w:right w:type="dxa" w:w="110"/>
+            </w:tcMar>
+            <w:vAlign w:val="top"/>
+          </w:tcPr>
+          <w:p>
+            <w:pPr>
+              <w:spacing w:after="40"/>
+            </w:pPr>
+            <w:r>
+              <w:rPr>
+                <w:rFonts w:ascii="Calibri" w:cs="Calibri" w:eastAsia="Calibri" w:hAnsi="Calibri"/>
+                <w:b/>
+                <w:bCs/>
+                <w:color w:val="FFFFFF"/>
+                <w:sz w:val="20"/>
+                <w:szCs w:val="20"/>
+              </w:rPr>
+              <w:t xml:space="preserve">Moment</w:t>
+            </w:r>
+          </w:p>
+        </w:tc>
+        <w:tc>
+          <w:tcPr>
+            <w:tcW w:type="dxa" w:w="7738"/>
+            <w:tcBorders>
+              <w:top w:val="single" w:color="C9D3CD" w:sz="4"/>
+              <w:left w:val="single" w:color="C9D3CD" w:sz="4"/>
+              <w:bottom w:val="single" w:color="C9D3CD" w:sz="4"/>
+              <w:right w:val="single" w:color="C9D3CD" w:sz="4"/>
+            </w:tcBorders>
+            <w:shd w:fill="1F3A5F" w:color="auto" w:val="clear"/>
+            <w:tcMar>
+              <w:top w:type="dxa" w:w="70"/>
+              <w:left w:type="dxa" w:w="110"/>
+              <w:bottom w:type="dxa" w:w="70"/>
+              <w:right w:type="dxa" w:w="110"/>
+            </w:tcMar>
+            <w:vAlign w:val="top"/>
+          </w:tcPr>
+          <w:p>
+            <w:pPr>
+              <w:spacing w:after="40"/>
+            </w:pPr>
+            <w:r>
+              <w:rPr>
+                <w:rFonts w:ascii="Calibri" w:cs="Calibri" w:eastAsia="Calibri" w:hAnsi="Calibri"/>
+                <w:b/>
+                <w:bCs/>
+                <w:color w:val="FFFFFF"/>
+                <w:sz w:val="20"/>
+                <w:szCs w:val="20"/>
+              </w:rPr>
+              <w:t xml:space="preserve">Ce que nous livrons</w:t>
+            </w:r>
+          </w:p>
+        </w:tc>
+      </w:tr>
+      <w:tr>
+        <w:trPr>
+          <w:cantSplit/>
+        </w:trPr>
+        <w:tc>
+          <w:tcPr>
+            <w:tcW w:type="dxa" w:w="1900"/>
+            <w:tcBorders>
+              <w:top w:val="single" w:color="C9D3CD" w:sz="4"/>
+              <w:left w:val="single" w:color="C9D3CD" w:sz="4"/>
+              <w:bottom w:val="single" w:color="C9D3CD" w:sz="4"/>
+              <w:right w:val="single" w:color="C9D3CD" w:sz="4"/>
+            </w:tcBorders>
+            <w:shd w:fill="EEF3F0" w:color="auto" w:val="clear"/>
+            <w:tcMar>
+              <w:top w:type="dxa" w:w="70"/>
+              <w:left w:type="dxa" w:w="110"/>
+              <w:bottom w:type="dxa" w:w="70"/>
+              <w:right w:type="dxa" w:w="110"/>
+            </w:tcMar>
+            <w:vAlign w:val="top"/>
+          </w:tcPr>
+          <w:p>
+            <w:pPr>
+              <w:spacing w:after="40"/>
+            </w:pPr>
+            <w:r>
+              <w:rPr>
+                <w:rFonts w:ascii="Calibri" w:cs="Calibri" w:eastAsia="Calibri" w:hAnsi="Calibri"/>
+                <w:b/>
+                <w:bCs/>
+                <w:sz w:val="20"/>
+                <w:szCs w:val="20"/>
+              </w:rPr>
+              <w:t xml:space="preserve">Avant le lancement</w:t>
+            </w:r>
+          </w:p>
+          <w:p>
+            <w:pPr>
+              <w:spacing w:after="40"/>
+            </w:pPr>
+            <w:r>
+              <w:rPr>
+                <w:rFonts w:ascii="Calibri" w:cs="Calibri" w:eastAsia="Calibri" w:hAnsi="Calibri"/>
+                <w:b/>
+                <w:bCs/>
+                <w:sz w:val="20"/>
+                <w:szCs w:val="20"/>
+              </w:rPr>
+              <w:t xml:space="preserve">(mois 0 à 2)</w:t>
+            </w:r>
+          </w:p>
+        </w:tc>
+        <w:tc>
+          <w:tcPr>
+            <w:tcW w:type="dxa" w:w="7738"/>
+            <w:tcBorders>
+              <w:top w:val="single" w:color="C9D3CD" w:sz="4"/>
+              <w:left w:val="single" w:color="C9D3CD" w:sz="4"/>
+              <w:bottom w:val="single" w:color="C9D3CD" w:sz="4"/>
+              <w:right w:val="single" w:color="C9D3CD" w:sz="4"/>
+            </w:tcBorders>
+            <w:tcMar>
+              <w:top w:type="dxa" w:w="70"/>
+              <w:left w:type="dxa" w:w="110"/>
+              <w:bottom w:type="dxa" w:w="70"/>
+              <w:right w:type="dxa" w:w="110"/>
+            </w:tcMar>
+            <w:vAlign w:val="top"/>
+          </w:tcPr>
+          <w:p>
+            <w:pPr>
+              <w:spacing w:after="40"/>
+            </w:pPr>
+            <w:r>
+              <w:rPr>
+                <w:rFonts w:ascii="Calibri" w:cs="Calibri" w:eastAsia="Calibri" w:hAnsi="Calibri"/>
+                <w:b/>
+                <w:bCs/>
+                <w:color w:val="1F7AE0"/>
+                <w:sz w:val="24"/>
+                <w:szCs w:val="24"/>
+              </w:rPr>
+              <w:t xml:space="preserve">● </w:t>
+            </w:r>
+            <w:r>
+              <w:rPr>
+                <w:rFonts w:ascii="Calibri" w:cs="Calibri" w:eastAsia="Calibri" w:hAnsi="Calibri"/>
+                <w:b w:val="false"/>
+                <w:bCs w:val="false"/>
+                <w:sz w:val="20"/>
+                <w:szCs w:val="20"/>
+              </w:rPr>
+              <w:t xml:space="preserve"> Étude locale, nom et marque, parcours d’accueil, plan de lancement</w:t>
+            </w:r>
+          </w:p>
+          <w:p>
+            <w:pPr>
+              <w:spacing w:after="40"/>
+            </w:pPr>
+            <w:r>
+              <w:rPr>
+                <w:rFonts w:ascii="Calibri" w:cs="Calibri" w:eastAsia="Calibri" w:hAnsi="Calibri"/>
+                <w:b/>
+                <w:bCs/>
+                <w:color w:val="0E9488"/>
+                <w:sz w:val="24"/>
+                <w:szCs w:val="24"/>
+              </w:rPr>
+              <w:t xml:space="preserve">● </w:t>
+            </w:r>
+            <w:r>
+              <w:rPr>
+                <w:rFonts w:ascii="Calibri" w:cs="Calibri" w:eastAsia="Calibri" w:hAnsi="Calibri"/>
+                <w:b w:val="false"/>
+                <w:bCs w:val="false"/>
+                <w:sz w:val="20"/>
+                <w:szCs w:val="20"/>
+              </w:rPr>
+              <w:t xml:space="preserve"> Modèles de documents, scripts, textes de base</w:t>
+            </w:r>
+          </w:p>
+        </w:tc>
+      </w:tr>
+      <w:tr>
+        <w:trPr>
+          <w:cantSplit/>
+        </w:trPr>
+        <w:tc>
+          <w:tcPr>
+            <w:tcW w:type="dxa" w:w="1900"/>
+            <w:tcBorders>
+              <w:top w:val="single" w:color="C9D3CD" w:sz="4"/>
+              <w:left w:val="single" w:color="C9D3CD" w:sz="4"/>
+              <w:bottom w:val="single" w:color="C9D3CD" w:sz="4"/>
+              <w:right w:val="single" w:color="C9D3CD" w:sz="4"/>
+            </w:tcBorders>
+            <w:shd w:fill="EEF3F0" w:color="auto" w:val="clear"/>
+            <w:tcMar>
+              <w:top w:type="dxa" w:w="70"/>
+              <w:left w:type="dxa" w:w="110"/>
+              <w:bottom w:type="dxa" w:w="70"/>
+              <w:right w:type="dxa" w:w="110"/>
+            </w:tcMar>
+            <w:vAlign w:val="top"/>
+          </w:tcPr>
+          <w:p>
+            <w:pPr>
+              <w:spacing w:after="40"/>
+            </w:pPr>
+            <w:r>
+              <w:rPr>
+                <w:rFonts w:ascii="Calibri" w:cs="Calibri" w:eastAsia="Calibri" w:hAnsi="Calibri"/>
+                <w:b/>
+                <w:bCs/>
+                <w:sz w:val="20"/>
+                <w:szCs w:val="20"/>
+              </w:rPr>
+              <w:t xml:space="preserve">Préparation</w:t>
+            </w:r>
+          </w:p>
+          <w:p>
+            <w:pPr>
+              <w:spacing w:after="40"/>
+            </w:pPr>
+            <w:r>
+              <w:rPr>
+                <w:rFonts w:ascii="Calibri" w:cs="Calibri" w:eastAsia="Calibri" w:hAnsi="Calibri"/>
+                <w:b/>
+                <w:bCs/>
+                <w:sz w:val="20"/>
+                <w:szCs w:val="20"/>
+              </w:rPr>
+              <w:t xml:space="preserve">(mois 2 à 4)</w:t>
+            </w:r>
+          </w:p>
+        </w:tc>
+        <w:tc>
+          <w:tcPr>
+            <w:tcW w:type="dxa" w:w="7738"/>
+            <w:tcBorders>
+              <w:top w:val="single" w:color="C9D3CD" w:sz="4"/>
+              <w:left w:val="single" w:color="C9D3CD" w:sz="4"/>
+              <w:bottom w:val="single" w:color="C9D3CD" w:sz="4"/>
+              <w:right w:val="single" w:color="C9D3CD" w:sz="4"/>
+            </w:tcBorders>
+            <w:shd w:fill="F8FAF9" w:color="auto" w:val="clear"/>
+            <w:tcMar>
+              <w:top w:type="dxa" w:w="70"/>
+              <w:left w:type="dxa" w:w="110"/>
+              <w:bottom w:type="dxa" w:w="70"/>
+              <w:right w:type="dxa" w:w="110"/>
+            </w:tcMar>
+            <w:vAlign w:val="top"/>
+          </w:tcPr>
+          <w:p>
+            <w:pPr>
+              <w:spacing w:after="40"/>
+            </w:pPr>
+            <w:r>
+              <w:rPr>
+                <w:rFonts w:ascii="Calibri" w:cs="Calibri" w:eastAsia="Calibri" w:hAnsi="Calibri"/>
+                <w:b/>
+                <w:bCs/>
+                <w:color w:val="7B4FBF"/>
+                <w:sz w:val="24"/>
+                <w:szCs w:val="24"/>
+              </w:rPr>
+              <w:t xml:space="preserve">● </w:t>
+            </w:r>
+            <w:r>
+              <w:rPr>
+                <w:rFonts w:ascii="Calibri" w:cs="Calibri" w:eastAsia="Calibri" w:hAnsi="Calibri"/>
+                <w:b w:val="false"/>
+                <w:bCs w:val="false"/>
+                <w:sz w:val="20"/>
+                <w:szCs w:val="20"/>
+              </w:rPr>
+              <w:t xml:space="preserve"> Site web, fiche Google, pages réseaux sociaux</w:t>
+            </w:r>
+          </w:p>
+          <w:p>
+            <w:pPr>
+              <w:spacing w:after="40"/>
+            </w:pPr>
+            <w:r>
+              <w:rPr>
+                <w:rFonts w:ascii="Calibri" w:cs="Calibri" w:eastAsia="Calibri" w:hAnsi="Calibri"/>
+                <w:b/>
+                <w:bCs/>
+                <w:color w:val="E07A1F"/>
+                <w:sz w:val="24"/>
+                <w:szCs w:val="24"/>
+              </w:rPr>
+              <w:t xml:space="preserve">● </w:t>
+            </w:r>
+            <w:r>
+              <w:rPr>
+                <w:rFonts w:ascii="Calibri" w:cs="Calibri" w:eastAsia="Calibri" w:hAnsi="Calibri"/>
+                <w:b w:val="false"/>
+                <w:bCs w:val="false"/>
+                <w:sz w:val="20"/>
+                <w:szCs w:val="20"/>
+              </w:rPr>
+              <w:t xml:space="preserve"> Cartes de visite, plaquette, dossier famille, livret</w:t>
+            </w:r>
+          </w:p>
+          <w:p>
+            <w:pPr>
+              <w:spacing w:after="40"/>
+            </w:pPr>
+            <w:r>
+              <w:rPr>
+                <w:rFonts w:ascii="Calibri" w:cs="Calibri" w:eastAsia="Calibri" w:hAnsi="Calibri"/>
+                <w:b/>
+                <w:bCs/>
+                <w:color w:val="0E9488"/>
+                <w:sz w:val="24"/>
+                <w:szCs w:val="24"/>
+              </w:rPr>
+              <w:t xml:space="preserve">● </w:t>
+            </w:r>
+            <w:r>
+              <w:rPr>
+                <w:rFonts w:ascii="Calibri" w:cs="Calibri" w:eastAsia="Calibri" w:hAnsi="Calibri"/>
+                <w:b w:val="false"/>
+                <w:bCs w:val="false"/>
+                <w:sz w:val="20"/>
+                <w:szCs w:val="20"/>
+              </w:rPr>
+              <w:t xml:space="preserve"> Guide « Que faire après un décès ? »</w:t>
+            </w:r>
+          </w:p>
+        </w:tc>
+      </w:tr>
+      <w:tr>
+        <w:trPr>
+          <w:cantSplit/>
+        </w:trPr>
+        <w:tc>
+          <w:tcPr>
+            <w:tcW w:type="dxa" w:w="1900"/>
+            <w:tcBorders>
+              <w:top w:val="single" w:color="C9D3CD" w:sz="4"/>
+              <w:left w:val="single" w:color="C9D3CD" w:sz="4"/>
+              <w:bottom w:val="single" w:color="C9D3CD" w:sz="4"/>
+              <w:right w:val="single" w:color="C9D3CD" w:sz="4"/>
+            </w:tcBorders>
+            <w:shd w:fill="EEF3F0" w:color="auto" w:val="clear"/>
+            <w:tcMar>
+              <w:top w:type="dxa" w:w="70"/>
+              <w:left w:type="dxa" w:w="110"/>
+              <w:bottom w:type="dxa" w:w="70"/>
+              <w:right w:type="dxa" w:w="110"/>
+            </w:tcMar>
+            <w:vAlign w:val="top"/>
+          </w:tcPr>
+          <w:p>
+            <w:pPr>
+              <w:spacing w:after="40"/>
+            </w:pPr>
+            <w:r>
+              <w:rPr>
+                <w:rFonts w:ascii="Calibri" w:cs="Calibri" w:eastAsia="Calibri" w:hAnsi="Calibri"/>
+                <w:b/>
+                <w:bCs/>
+                <w:sz w:val="20"/>
+                <w:szCs w:val="20"/>
+              </w:rPr>
+              <w:t xml:space="preserve">Lancement</w:t>
+            </w:r>
+          </w:p>
+          <w:p>
+            <w:pPr>
+              <w:spacing w:after="40"/>
+            </w:pPr>
+            <w:r>
+              <w:rPr>
+                <w:rFonts w:ascii="Calibri" w:cs="Calibri" w:eastAsia="Calibri" w:hAnsi="Calibri"/>
+                <w:b/>
+                <w:bCs/>
+                <w:sz w:val="20"/>
+                <w:szCs w:val="20"/>
+              </w:rPr>
+              <w:t xml:space="preserve">(mois 4 à 6)</w:t>
+            </w:r>
+          </w:p>
+        </w:tc>
+        <w:tc>
+          <w:tcPr>
+            <w:tcW w:type="dxa" w:w="7738"/>
+            <w:tcBorders>
+              <w:top w:val="single" w:color="C9D3CD" w:sz="4"/>
+              <w:left w:val="single" w:color="C9D3CD" w:sz="4"/>
+              <w:bottom w:val="single" w:color="C9D3CD" w:sz="4"/>
+              <w:right w:val="single" w:color="C9D3CD" w:sz="4"/>
+            </w:tcBorders>
+            <w:tcMar>
+              <w:top w:type="dxa" w:w="70"/>
+              <w:left w:type="dxa" w:w="110"/>
+              <w:bottom w:type="dxa" w:w="70"/>
+              <w:right w:type="dxa" w:w="110"/>
+            </w:tcMar>
+            <w:vAlign w:val="top"/>
+          </w:tcPr>
+          <w:p>
+            <w:pPr>
+              <w:spacing w:after="40"/>
+            </w:pPr>
+            <w:r>
+              <w:rPr>
+                <w:rFonts w:ascii="Calibri" w:cs="Calibri" w:eastAsia="Calibri" w:hAnsi="Calibri"/>
+                <w:b/>
+                <w:bCs/>
+                <w:color w:val="7B4FBF"/>
+                <w:sz w:val="24"/>
+                <w:szCs w:val="24"/>
+              </w:rPr>
+              <w:t xml:space="preserve">● </w:t>
+            </w:r>
+            <w:r>
+              <w:rPr>
+                <w:rFonts w:ascii="Calibri" w:cs="Calibri" w:eastAsia="Calibri" w:hAnsi="Calibri"/>
+                <w:b w:val="false"/>
+                <w:bCs w:val="false"/>
+                <w:sz w:val="20"/>
+                <w:szCs w:val="20"/>
+              </w:rPr>
+              <w:t xml:space="preserve"> Premières publications, collecte d’avis</w:t>
+            </w:r>
+          </w:p>
+          <w:p>
+            <w:pPr>
+              <w:spacing w:after="40"/>
+            </w:pPr>
+            <w:r>
+              <w:rPr>
+                <w:rFonts w:ascii="Calibri" w:cs="Calibri" w:eastAsia="Calibri" w:hAnsi="Calibri"/>
+                <w:b/>
+                <w:bCs/>
+                <w:color w:val="1F7AE0"/>
+                <w:sz w:val="24"/>
+                <w:szCs w:val="24"/>
+              </w:rPr>
+              <w:t xml:space="preserve">● </w:t>
+            </w:r>
+            <w:r>
+              <w:rPr>
+                <w:rFonts w:ascii="Calibri" w:cs="Calibri" w:eastAsia="Calibri" w:hAnsi="Calibri"/>
+                <w:b w:val="false"/>
+                <w:bCs w:val="false"/>
+                <w:sz w:val="20"/>
+                <w:szCs w:val="20"/>
+              </w:rPr>
+              <w:t xml:space="preserve"> Suivi des premiers dossiers et ajustements</w:t>
+            </w:r>
+          </w:p>
+        </w:tc>
+      </w:tr>
+      <w:tr>
+        <w:trPr>
+          <w:cantSplit/>
+        </w:trPr>
+        <w:tc>
+          <w:tcPr>
+            <w:tcW w:type="dxa" w:w="1900"/>
+            <w:tcBorders>
+              <w:top w:val="single" w:color="C9D3CD" w:sz="4"/>
+              <w:left w:val="single" w:color="C9D3CD" w:sz="4"/>
+              <w:bottom w:val="single" w:color="C9D3CD" w:sz="4"/>
+              <w:right w:val="single" w:color="C9D3CD" w:sz="4"/>
+            </w:tcBorders>
+            <w:shd w:fill="EEF3F0" w:color="auto" w:val="clear"/>
+            <w:tcMar>
+              <w:top w:type="dxa" w:w="70"/>
+              <w:left w:type="dxa" w:w="110"/>
+              <w:bottom w:type="dxa" w:w="70"/>
+              <w:right w:type="dxa" w:w="110"/>
+            </w:tcMar>
+            <w:vAlign w:val="top"/>
+          </w:tcPr>
+          <w:p>
+            <w:pPr>
+              <w:spacing w:after="40"/>
+            </w:pPr>
+            <w:r>
+              <w:rPr>
+                <w:rFonts w:ascii="Calibri" w:cs="Calibri" w:eastAsia="Calibri" w:hAnsi="Calibri"/>
+                <w:b/>
+                <w:bCs/>
+                <w:sz w:val="20"/>
+                <w:szCs w:val="20"/>
+              </w:rPr>
+              <w:t xml:space="preserve">En continu</w:t>
+            </w:r>
+          </w:p>
+        </w:tc>
+        <w:tc>
+          <w:tcPr>
+            <w:tcW w:type="dxa" w:w="7738"/>
+            <w:tcBorders>
+              <w:top w:val="single" w:color="C9D3CD" w:sz="4"/>
+              <w:left w:val="single" w:color="C9D3CD" w:sz="4"/>
+              <w:bottom w:val="single" w:color="C9D3CD" w:sz="4"/>
+              <w:right w:val="single" w:color="C9D3CD" w:sz="4"/>
+            </w:tcBorders>
+            <w:shd w:fill="F8FAF9" w:color="auto" w:val="clear"/>
+            <w:tcMar>
+              <w:top w:type="dxa" w:w="70"/>
+              <w:left w:type="dxa" w:w="110"/>
+              <w:bottom w:type="dxa" w:w="70"/>
+              <w:right w:type="dxa" w:w="110"/>
+            </w:tcMar>
+            <w:vAlign w:val="top"/>
+          </w:tcPr>
+          <w:p>
+            <w:pPr>
+              <w:spacing w:after="40"/>
+            </w:pPr>
+            <w:r>
+              <w:rPr>
+                <w:rFonts w:ascii="Calibri" w:cs="Calibri" w:eastAsia="Calibri" w:hAnsi="Calibri"/>
+                <w:b/>
+                <w:bCs/>
+                <w:color w:val="7B4FBF"/>
+                <w:sz w:val="24"/>
+                <w:szCs w:val="24"/>
+              </w:rPr>
+              <w:t xml:space="preserve">● </w:t>
+            </w:r>
+            <w:r>
+              <w:rPr>
+                <w:rFonts w:ascii="Calibri" w:cs="Calibri" w:eastAsia="Calibri" w:hAnsi="Calibri"/>
+                <w:b w:val="false"/>
+                <w:bCs w:val="false"/>
+                <w:sz w:val="20"/>
+                <w:szCs w:val="20"/>
+              </w:rPr>
+              <w:t xml:space="preserve"> Suivi mensuel et reporting</w:t>
+            </w:r>
+          </w:p>
+          <w:p>
+            <w:pPr>
+              <w:spacing w:after="40"/>
+            </w:pPr>
+            <w:r>
+              <w:rPr>
+                <w:rFonts w:ascii="Calibri" w:cs="Calibri" w:eastAsia="Calibri" w:hAnsi="Calibri"/>
+                <w:b/>
+                <w:bCs/>
+                <w:color w:val="E07A1F"/>
+                <w:sz w:val="24"/>
+                <w:szCs w:val="24"/>
+              </w:rPr>
+              <w:t xml:space="preserve">● </w:t>
+            </w:r>
+            <w:r>
+              <w:rPr>
+                <w:rFonts w:ascii="Calibri" w:cs="Calibri" w:eastAsia="Calibri" w:hAnsi="Calibri"/>
+                <w:b w:val="false"/>
+                <w:bCs w:val="false"/>
+                <w:sz w:val="20"/>
+                <w:szCs w:val="20"/>
+              </w:rPr>
+              <w:t xml:space="preserve"> Flocage et impressions à la demande, saison Toussaint</w:t>
+            </w:r>
+          </w:p>
+          <w:p>
+            <w:pPr>
+              <w:spacing w:after="40"/>
+            </w:pPr>
+            <w:r>
+              <w:rPr>
+                <w:rFonts w:ascii="Calibri" w:cs="Calibri" w:eastAsia="Calibri" w:hAnsi="Calibri"/>
+                <w:b/>
+                <w:bCs/>
+                <w:color w:val="0E9488"/>
+                <w:sz w:val="24"/>
+                <w:szCs w:val="24"/>
+              </w:rPr>
+              <w:t xml:space="preserve">● </w:t>
+            </w:r>
+            <w:r>
+              <w:rPr>
+                <w:rFonts w:ascii="Calibri" w:cs="Calibri" w:eastAsia="Calibri" w:hAnsi="Calibri"/>
+                <w:b w:val="false"/>
+                <w:bCs w:val="false"/>
+                <w:sz w:val="20"/>
+                <w:szCs w:val="20"/>
+              </w:rPr>
+              <w:t xml:space="preserve"> Contenus réguliers</w:t>
+            </w:r>
+          </w:p>
+        </w:tc>
+      </w:tr>
+    </w:tbl>
+    <w:p>
+      <w:pPr>
+        <w:spacing w:after="80"/>
+      </w:pPr>
+    </w:p>
+    <w:tbl>
+      <w:tblPr>
+        <w:tblW w:type="dxa" w:w="9638"/>
+        <w:tblBorders>
+          <w:top w:val="single" w:color="auto" w:sz="4"/>
+          <w:left w:val="single" w:color="auto" w:sz="4"/>
+          <w:bottom w:val="single" w:color="auto" w:sz="4"/>
+          <w:right w:val="single" w:color="auto" w:sz="4"/>
+          <w:insideH w:val="single" w:color="auto" w:sz="4"/>
+          <w:insideV w:val="single" w:color="auto" w:sz="4"/>
+        </w:tblBorders>
+      </w:tblPr>
+      <w:tblGrid>
+        <w:gridCol w:w="9638"/>
+      </w:tblGrid>
+      <w:tr>
+        <w:trPr>
+          <w:cantSplit/>
+        </w:trPr>
+        <w:tc>
+          <w:tcPr>
+            <w:tcW w:type="dxa" w:w="9638"/>
+            <w:tcBorders>
+              <w:top w:val="none" w:color="FFFFFF" w:sz="0"/>
+              <w:left w:val="single" w:color="C98A00" w:sz="24"/>
+              <w:bottom w:val="none" w:color="FFFFFF" w:sz="0"/>
+              <w:right w:val="none" w:color="FFFFFF" w:sz="0"/>
+            </w:tcBorders>
+            <w:shd w:fill="FFF4DC" w:color="auto" w:val="clear"/>
+            <w:tcMar>
+              <w:top w:type="dxa" w:w="100"/>
+              <w:left w:type="dxa" w:w="180"/>
+              <w:bottom w:type="dxa" w:w="100"/>
+              <w:right w:type="dxa" w:w="160"/>
+            </w:tcMar>
+          </w:tcPr>
+          <w:p>
+            <w:pPr>
+              <w:spacing w:after="60"/>
+            </w:pPr>
+            <w:r>
+              <w:rPr>
+                <w:rFonts w:ascii="Calibri" w:cs="Calibri" w:eastAsia="Calibri" w:hAnsi="Calibri"/>
+                <w:b/>
+                <w:bCs/>
+                <w:color w:val="C98A00"/>
+                <w:sz w:val="22"/>
+                <w:szCs w:val="22"/>
+              </w:rPr>
+              <w:t xml:space="preserve">Ce que nous coordonnons mais ne remplaçons pas</w:t>
+            </w:r>
+          </w:p>
+          <w:p>
+            <w:pPr>
+              <w:spacing w:after="50"/>
+            </w:pPr>
+            <w:r>
+              <w:rPr>
+                <w:rFonts w:ascii="Calibri" w:cs="Calibri" w:eastAsia="Calibri" w:hAnsi="Calibri"/>
+                <w:b/>
+                <w:bCs/>
+                <w:sz w:val="21"/>
+                <w:szCs w:val="21"/>
+              </w:rPr>
+              <w:t xml:space="preserve">Habilitation funéraire</w:t>
+            </w:r>
+            <w:r>
+              <w:rPr>
+                <w:rFonts w:ascii="Calibri" w:cs="Calibri" w:eastAsia="Calibri" w:hAnsi="Calibri"/>
+                <w:sz w:val="21"/>
+                <w:szCs w:val="21"/>
+              </w:rPr>
+              <w:t xml:space="preserve"> → préfecture · </w:t>
+            </w:r>
+            <w:r>
+              <w:rPr>
+                <w:rFonts w:ascii="Calibri" w:cs="Calibri" w:eastAsia="Calibri" w:hAnsi="Calibri"/>
+                <w:b/>
+                <w:bCs/>
+                <w:sz w:val="21"/>
+                <w:szCs w:val="21"/>
+              </w:rPr>
+              <w:t xml:space="preserve">Statut et comptabilité</w:t>
+            </w:r>
+            <w:r>
+              <w:rPr>
+                <w:rFonts w:ascii="Calibri" w:cs="Calibri" w:eastAsia="Calibri" w:hAnsi="Calibri"/>
+                <w:sz w:val="21"/>
+                <w:szCs w:val="21"/>
+              </w:rPr>
+              <w:t xml:space="preserve"> → expert-comptable · </w:t>
+            </w:r>
+            <w:r>
+              <w:rPr>
+                <w:rFonts w:ascii="Calibri" w:cs="Calibri" w:eastAsia="Calibri" w:hAnsi="Calibri"/>
+                <w:b/>
+                <w:bCs/>
+                <w:sz w:val="21"/>
+                <w:szCs w:val="21"/>
+              </w:rPr>
+              <w:t xml:space="preserve">Assurances</w:t>
+            </w:r>
+            <w:r>
+              <w:rPr>
+                <w:rFonts w:ascii="Calibri" w:cs="Calibri" w:eastAsia="Calibri" w:hAnsi="Calibri"/>
+                <w:sz w:val="21"/>
+                <w:szCs w:val="21"/>
+              </w:rPr>
+              <w:t xml:space="preserve"> → courtier ou assureur · </w:t>
+            </w:r>
+            <w:r>
+              <w:rPr>
+                <w:rFonts w:ascii="Calibri" w:cs="Calibri" w:eastAsia="Calibri" w:hAnsi="Calibri"/>
+                <w:b/>
+                <w:bCs/>
+                <w:sz w:val="21"/>
+                <w:szCs w:val="21"/>
+              </w:rPr>
+              <w:t xml:space="preserve">Questions juridiques</w:t>
+            </w:r>
+            <w:r>
+              <w:rPr>
+                <w:rFonts w:ascii="Calibri" w:cs="Calibri" w:eastAsia="Calibri" w:hAnsi="Calibri"/>
+                <w:sz w:val="21"/>
+                <w:szCs w:val="21"/>
+              </w:rPr>
+              <w:t xml:space="preserve"> → avocat ou notaire · </w:t>
+            </w:r>
+            <w:r>
+              <w:rPr>
+                <w:rFonts w:ascii="Calibri" w:cs="Calibri" w:eastAsia="Calibri" w:hAnsi="Calibri"/>
+                <w:b/>
+                <w:bCs/>
+                <w:sz w:val="21"/>
+                <w:szCs w:val="21"/>
+              </w:rPr>
+              <w:t xml:space="preserve">Accompagnement psychologique</w:t>
+            </w:r>
+            <w:r>
+              <w:rPr>
+                <w:rFonts w:ascii="Calibri" w:cs="Calibri" w:eastAsia="Calibri" w:hAnsi="Calibri"/>
+                <w:sz w:val="21"/>
+                <w:szCs w:val="21"/>
+              </w:rPr>
+              <w:t xml:space="preserve"> → psychologue diplômé.</w:t>
+            </w:r>
+          </w:p>
+          <w:p>
+            <w:pPr>
+              <w:spacing w:after="50"/>
+            </w:pPr>
+            <w:r>
+              <w:rPr>
+                <w:rFonts w:ascii="Calibri" w:cs="Calibri" w:eastAsia="Calibri" w:hAnsi="Calibri"/>
+                <w:sz w:val="21"/>
+                <w:szCs w:val="21"/>
+              </w:rPr>
+              <w:t xml:space="preserve">Nous préparons les questions à leur poser (Annexe E) et veillons à ce que votre communication soit cohérente avec leurs conseils.</w:t>
             </w:r>
           </w:p>
         </w:tc>

</xml_diff>

<commit_message>
Dossier funéraire : tutoiement et tableau « Tu as le droit de / Tu n'as pas le droit de »
Co-Authored-By: Claude Sonnet 5.5 <noreply@anthropic.com>
Claude-Session: https://claude.ai/code/session_01GSJyNfSpKfJ6NJhj9v1Yvo
</commit_message>
<xml_diff>
--- a/dossier-accompagnement-funeraire/Dossier_Projet_Accompagnement_Funeraire.docx
+++ b/dossier-accompagnement-funeraire/Dossier_Projet_Accompagnement_Funeraire.docx
@@ -505,7 +505,7 @@
                 <w:sz w:val="20"/>
                 <w:szCs w:val="20"/>
               </w:rPr>
-              <w:t xml:space="preserve">Notre accompagnement : sur quoi nous pouvons vous aider</w:t>
+              <w:t xml:space="preserve">Notre accompagnement : sur quoi nous pouvons t’aider</w:t>
             </w:r>
           </w:p>
         </w:tc>
@@ -723,7 +723,7 @@
                 <w:sz w:val="20"/>
                 <w:szCs w:val="20"/>
               </w:rPr>
-              <w:t xml:space="preserve">Cadre réglementaire : ce qu’elle a le droit de faire (et pas)</w:t>
+              <w:t xml:space="preserve">Cadre réglementaire : ce que tu as le droit de faire (et pas)</w:t>
             </w:r>
           </w:p>
         </w:tc>
@@ -2197,7 +2197,7 @@
           <w:sz w:val="36"/>
           <w:szCs w:val="36"/>
         </w:rPr>
-        <w:t xml:space="preserve">Notre accompagnement : sur quoi nous pouvons vous aider</w:t>
+        <w:t xml:space="preserve">Notre accompagnement : sur quoi nous pouvons t’aider</w:t>
       </w:r>
     </w:p>
     <w:p>
@@ -2210,7 +2210,7 @@
           <w:sz w:val="22"/>
           <w:szCs w:val="22"/>
         </w:rPr>
-        <w:t xml:space="preserve">Horizon Vendée est votre agence de communication. Voici, en un coup d’œil, </w:t>
+        <w:t xml:space="preserve">Horizon Vendée est ton agence de communication. Voici, en un coup d’œil, </w:t>
       </w:r>
       <w:r>
         <w:rPr>
@@ -2228,7 +2228,7 @@
           <w:sz w:val="22"/>
           <w:szCs w:val="22"/>
         </w:rPr>
-        <w:t xml:space="preserve"> pour le lancement de votre activité. Les pastilles de couleur de ce dossier renvoient à ces quatre familles. Les tarifs sont établis </w:t>
+        <w:t xml:space="preserve"> pour le lancement de ton activité. Les pastilles de couleur de ce dossier renvoient à ces quatre familles. Les tarifs sont établis </w:t>
       </w:r>
       <w:r>
         <w:rPr>
@@ -2246,7 +2246,7 @@
           <w:sz w:val="22"/>
           <w:szCs w:val="22"/>
         </w:rPr>
-        <w:t xml:space="preserve">, selon vos priorités et votre budget.</w:t>
+        <w:t xml:space="preserve">, selon tes priorités et ton budget.</w:t>
       </w:r>
     </w:p>
     <w:p>
@@ -4630,7 +4630,7 @@
                 <w:sz w:val="21"/>
                 <w:szCs w:val="21"/>
               </w:rPr>
-              <w:t xml:space="preserve">Nous préparons les questions à leur poser (Annexe E) et veillons à ce que votre communication soit cohérente avec leurs conseils.</w:t>
+              <w:t xml:space="preserve">Nous préparons les questions à leur poser (Annexe E) et veillons à ce que ta communication soit cohérente avec leurs conseils.</w:t>
             </w:r>
           </w:p>
         </w:tc>
@@ -4655,6 +4655,37 @@
           <w:szCs w:val="36"/>
         </w:rPr>
         <w:t xml:space="preserve">0. Mode d’emploi et avertissements</w:t>
+      </w:r>
+    </w:p>
+    <w:p>
+      <w:pPr>
+        <w:spacing w:after="120" w:line="276"/>
+      </w:pPr>
+      <w:r>
+        <w:rPr>
+          <w:rFonts w:ascii="Calibri" w:cs="Calibri" w:eastAsia="Calibri" w:hAnsi="Calibri"/>
+          <w:sz w:val="22"/>
+          <w:szCs w:val="22"/>
+        </w:rPr>
+        <w:t xml:space="preserve">Angéline, ce dossier est écrit </w:t>
+      </w:r>
+      <w:r>
+        <w:rPr>
+          <w:rFonts w:ascii="Calibri" w:cs="Calibri" w:eastAsia="Calibri" w:hAnsi="Calibri"/>
+          <w:b/>
+          <w:bCs/>
+          <w:sz w:val="22"/>
+          <w:szCs w:val="22"/>
+        </w:rPr>
+        <w:t xml:space="preserve">pour toi</w:t>
+      </w:r>
+      <w:r>
+        <w:rPr>
+          <w:rFonts w:ascii="Calibri" w:cs="Calibri" w:eastAsia="Calibri" w:hAnsi="Calibri"/>
+          <w:sz w:val="22"/>
+          <w:szCs w:val="22"/>
+        </w:rPr>
+        <w:t xml:space="preserve"> : il te dit ce que tu as le droit de faire, ce que tu dois vérifier, et sur quoi on peut t’aider. Prends-le avec un crayon.</w:t>
       </w:r>
     </w:p>
     <w:p>
@@ -5147,7 +5178,7 @@
                 <w:sz w:val="22"/>
                 <w:szCs w:val="22"/>
               </w:rPr>
-              <w:t xml:space="preserve">Légende : où l’agence peut vous aider</w:t>
+              <w:t xml:space="preserve">Légende : où l’agence peut t’aider</w:t>
             </w:r>
           </w:p>
           <w:p>
@@ -6478,7 +6509,7 @@
           <w:sz w:val="22"/>
           <w:szCs w:val="22"/>
         </w:rPr>
-        <w:t xml:space="preserve"> : une professionnelle locale, joignable, qui connaît les cimetières, mairies et notaires du secteur.</w:t>
+        <w:t xml:space="preserve"> : tu es une professionnelle locale, joignable, qui connaît les cimetières, mairies et notaires du secteur.</w:t>
       </w:r>
     </w:p>
     <w:p>
@@ -6600,7 +6631,7 @@
           <w:sz w:val="36"/>
           <w:szCs w:val="36"/>
         </w:rPr>
-        <w:t xml:space="preserve">2. Cadre réglementaire : ce qu’elle a le droit de faire</w:t>
+        <w:t xml:space="preserve">2. Cadre réglementaire : ce que tu as le droit de faire</w:t>
       </w:r>
     </w:p>
     <w:p>
@@ -6613,8 +6644,503 @@
           <w:sz w:val="22"/>
           <w:szCs w:val="22"/>
         </w:rPr>
-        <w:t xml:space="preserve">C’est le chapitre le plus important du dossier. Une erreur ici peut entraîner des amendes lourdes ou l’interdiction d’exercer.</w:t>
-      </w:r>
+        <w:t xml:space="preserve">C’est le chapitre le plus important du dossier : ici, on te dit clairement </w:t>
+      </w:r>
+      <w:r>
+        <w:rPr>
+          <w:rFonts w:ascii="Calibri" w:cs="Calibri" w:eastAsia="Calibri" w:hAnsi="Calibri"/>
+          <w:b/>
+          <w:bCs/>
+          <w:sz w:val="22"/>
+          <w:szCs w:val="22"/>
+        </w:rPr>
+        <w:t xml:space="preserve">ce que tu as le droit de faire, ce qui est encadré et ce qui t’est interdit</w:t>
+      </w:r>
+      <w:r>
+        <w:rPr>
+          <w:rFonts w:ascii="Calibri" w:cs="Calibri" w:eastAsia="Calibri" w:hAnsi="Calibri"/>
+          <w:sz w:val="22"/>
+          <w:szCs w:val="22"/>
+        </w:rPr>
+        <w:t xml:space="preserve">. Une erreur peut entraîner des amendes lourdes ou l’interdiction d’exercer.</w:t>
+      </w:r>
+    </w:p>
+    <w:tbl>
+      <w:tblPr>
+        <w:tblW w:type="dxa" w:w="9638"/>
+        <w:tblBorders>
+          <w:top w:val="single" w:color="auto" w:sz="4"/>
+          <w:left w:val="single" w:color="auto" w:sz="4"/>
+          <w:bottom w:val="single" w:color="auto" w:sz="4"/>
+          <w:right w:val="single" w:color="auto" w:sz="4"/>
+          <w:insideH w:val="single" w:color="auto" w:sz="4"/>
+          <w:insideV w:val="single" w:color="auto" w:sz="4"/>
+        </w:tblBorders>
+      </w:tblPr>
+      <w:tblGrid>
+        <w:gridCol w:w="4819"/>
+        <w:gridCol w:w="4819"/>
+      </w:tblGrid>
+      <w:tr>
+        <w:trPr>
+          <w:cantSplit/>
+          <w:tblHeader/>
+        </w:trPr>
+        <w:tc>
+          <w:tcPr>
+            <w:tcW w:type="dxa" w:w="4819"/>
+            <w:tcBorders>
+              <w:top w:val="single" w:color="C9D3CD" w:sz="4"/>
+              <w:left w:val="single" w:color="C9D3CD" w:sz="4"/>
+              <w:bottom w:val="single" w:color="C9D3CD" w:sz="4"/>
+              <w:right w:val="single" w:color="C9D3CD" w:sz="4"/>
+            </w:tcBorders>
+            <w:shd w:fill="1F3A5F" w:color="auto" w:val="clear"/>
+            <w:tcMar>
+              <w:top w:type="dxa" w:w="70"/>
+              <w:left w:type="dxa" w:w="110"/>
+              <w:bottom w:type="dxa" w:w="70"/>
+              <w:right w:type="dxa" w:w="110"/>
+            </w:tcMar>
+            <w:vAlign w:val="top"/>
+          </w:tcPr>
+          <w:p>
+            <w:pPr>
+              <w:spacing w:after="40"/>
+            </w:pPr>
+            <w:r>
+              <w:rPr>
+                <w:rFonts w:ascii="Calibri" w:cs="Calibri" w:eastAsia="Calibri" w:hAnsi="Calibri"/>
+                <w:b/>
+                <w:bCs/>
+                <w:color w:val="FFFFFF"/>
+                <w:sz w:val="20"/>
+                <w:szCs w:val="20"/>
+              </w:rPr>
+              <w:t xml:space="preserve">✅ Tu as le droit de…</w:t>
+            </w:r>
+          </w:p>
+        </w:tc>
+        <w:tc>
+          <w:tcPr>
+            <w:tcW w:type="dxa" w:w="4819"/>
+            <w:tcBorders>
+              <w:top w:val="single" w:color="C9D3CD" w:sz="4"/>
+              <w:left w:val="single" w:color="C9D3CD" w:sz="4"/>
+              <w:bottom w:val="single" w:color="C9D3CD" w:sz="4"/>
+              <w:right w:val="single" w:color="C9D3CD" w:sz="4"/>
+            </w:tcBorders>
+            <w:shd w:fill="1F3A5F" w:color="auto" w:val="clear"/>
+            <w:tcMar>
+              <w:top w:type="dxa" w:w="70"/>
+              <w:left w:type="dxa" w:w="110"/>
+              <w:bottom w:type="dxa" w:w="70"/>
+              <w:right w:type="dxa" w:w="110"/>
+            </w:tcMar>
+            <w:vAlign w:val="top"/>
+          </w:tcPr>
+          <w:p>
+            <w:pPr>
+              <w:spacing w:after="40"/>
+            </w:pPr>
+            <w:r>
+              <w:rPr>
+                <w:rFonts w:ascii="Calibri" w:cs="Calibri" w:eastAsia="Calibri" w:hAnsi="Calibri"/>
+                <w:b/>
+                <w:bCs/>
+                <w:color w:val="FFFFFF"/>
+                <w:sz w:val="20"/>
+                <w:szCs w:val="20"/>
+              </w:rPr>
+              <w:t xml:space="preserve">⛔ Tu n’as pas le droit de…</w:t>
+            </w:r>
+          </w:p>
+        </w:tc>
+      </w:tr>
+      <w:tr>
+        <w:trPr>
+          <w:cantSplit/>
+        </w:trPr>
+        <w:tc>
+          <w:tcPr>
+            <w:tcW w:type="dxa" w:w="4819"/>
+            <w:tcBorders>
+              <w:top w:val="single" w:color="C9D3CD" w:sz="4"/>
+              <w:left w:val="single" w:color="C9D3CD" w:sz="4"/>
+              <w:bottom w:val="single" w:color="C9D3CD" w:sz="4"/>
+              <w:right w:val="single" w:color="C9D3CD" w:sz="4"/>
+            </w:tcBorders>
+            <w:tcMar>
+              <w:top w:type="dxa" w:w="70"/>
+              <w:left w:type="dxa" w:w="110"/>
+              <w:bottom w:type="dxa" w:w="70"/>
+              <w:right w:type="dxa" w:w="110"/>
+            </w:tcMar>
+            <w:vAlign w:val="top"/>
+          </w:tcPr>
+          <w:p>
+            <w:pPr>
+              <w:spacing w:after="40"/>
+            </w:pPr>
+            <w:r>
+              <w:rPr>
+                <w:rFonts w:ascii="Calibri" w:cs="Calibri" w:eastAsia="Calibri" w:hAnsi="Calibri"/>
+                <w:sz w:val="20"/>
+                <w:szCs w:val="20"/>
+              </w:rPr>
+              <w:t xml:space="preserve">Aider les familles à constituer et envoyer leurs dossiers (banques, assurances, caisses, abonnements)</w:t>
+            </w:r>
+          </w:p>
+        </w:tc>
+        <w:tc>
+          <w:tcPr>
+            <w:tcW w:type="dxa" w:w="4819"/>
+            <w:tcBorders>
+              <w:top w:val="single" w:color="C9D3CD" w:sz="4"/>
+              <w:left w:val="single" w:color="C9D3CD" w:sz="4"/>
+              <w:bottom w:val="single" w:color="C9D3CD" w:sz="4"/>
+              <w:right w:val="single" w:color="C9D3CD" w:sz="4"/>
+            </w:tcBorders>
+            <w:tcMar>
+              <w:top w:type="dxa" w:w="70"/>
+              <w:left w:type="dxa" w:w="110"/>
+              <w:bottom w:type="dxa" w:w="70"/>
+              <w:right w:type="dxa" w:w="110"/>
+            </w:tcMar>
+            <w:vAlign w:val="top"/>
+          </w:tcPr>
+          <w:p>
+            <w:pPr>
+              <w:spacing w:after="40"/>
+            </w:pPr>
+            <w:r>
+              <w:rPr>
+                <w:rFonts w:ascii="Calibri" w:cs="Calibri" w:eastAsia="Calibri" w:hAnsi="Calibri"/>
+                <w:sz w:val="20"/>
+                <w:szCs w:val="20"/>
+              </w:rPr>
+              <w:t xml:space="preserve">Organiser des obsèques ou transporter un corps </w:t>
+            </w:r>
+            <w:r>
+              <w:rPr>
+                <w:rFonts w:ascii="Calibri" w:cs="Calibri" w:eastAsia="Calibri" w:hAnsi="Calibri"/>
+                <w:sz w:val="20"/>
+                <w:szCs w:val="20"/>
+              </w:rPr>
+              <w:t xml:space="preserve">sans habilitation préfectorale</w:t>
+            </w:r>
+          </w:p>
+        </w:tc>
+      </w:tr>
+      <w:tr>
+        <w:trPr>
+          <w:cantSplit/>
+        </w:trPr>
+        <w:tc>
+          <w:tcPr>
+            <w:tcW w:type="dxa" w:w="4819"/>
+            <w:tcBorders>
+              <w:top w:val="single" w:color="C9D3CD" w:sz="4"/>
+              <w:left w:val="single" w:color="C9D3CD" w:sz="4"/>
+              <w:bottom w:val="single" w:color="C9D3CD" w:sz="4"/>
+              <w:right w:val="single" w:color="C9D3CD" w:sz="4"/>
+            </w:tcBorders>
+            <w:shd w:fill="F8FAF9" w:color="auto" w:val="clear"/>
+            <w:tcMar>
+              <w:top w:type="dxa" w:w="70"/>
+              <w:left w:type="dxa" w:w="110"/>
+              <w:bottom w:type="dxa" w:w="70"/>
+              <w:right w:type="dxa" w:w="110"/>
+            </w:tcMar>
+            <w:vAlign w:val="top"/>
+          </w:tcPr>
+          <w:p>
+            <w:pPr>
+              <w:spacing w:after="40"/>
+            </w:pPr>
+            <w:r>
+              <w:rPr>
+                <w:rFonts w:ascii="Calibri" w:cs="Calibri" w:eastAsia="Calibri" w:hAnsi="Calibri"/>
+                <w:sz w:val="20"/>
+                <w:szCs w:val="20"/>
+              </w:rPr>
+              <w:t xml:space="preserve">Entretenir, nettoyer et fleurir des sépultures (avec l’accord de la famille et le règlement du cimetière)</w:t>
+            </w:r>
+          </w:p>
+        </w:tc>
+        <w:tc>
+          <w:tcPr>
+            <w:tcW w:type="dxa" w:w="4819"/>
+            <w:tcBorders>
+              <w:top w:val="single" w:color="C9D3CD" w:sz="4"/>
+              <w:left w:val="single" w:color="C9D3CD" w:sz="4"/>
+              <w:bottom w:val="single" w:color="C9D3CD" w:sz="4"/>
+              <w:right w:val="single" w:color="C9D3CD" w:sz="4"/>
+            </w:tcBorders>
+            <w:shd w:fill="F8FAF9" w:color="auto" w:val="clear"/>
+            <w:tcMar>
+              <w:top w:type="dxa" w:w="70"/>
+              <w:left w:type="dxa" w:w="110"/>
+              <w:bottom w:type="dxa" w:w="70"/>
+              <w:right w:type="dxa" w:w="110"/>
+            </w:tcMar>
+            <w:vAlign w:val="top"/>
+          </w:tcPr>
+          <w:p>
+            <w:pPr>
+              <w:spacing w:after="40"/>
+            </w:pPr>
+            <w:r>
+              <w:rPr>
+                <w:rFonts w:ascii="Calibri" w:cs="Calibri" w:eastAsia="Calibri" w:hAnsi="Calibri"/>
+                <w:sz w:val="20"/>
+                <w:szCs w:val="20"/>
+              </w:rPr>
+              <w:t xml:space="preserve">Contacter une famille pour lui proposer tes services </w:t>
+            </w:r>
+            <w:r>
+              <w:rPr>
+                <w:rFonts w:ascii="Calibri" w:cs="Calibri" w:eastAsia="Calibri" w:hAnsi="Calibri"/>
+                <w:sz w:val="20"/>
+                <w:szCs w:val="20"/>
+              </w:rPr>
+              <w:t xml:space="preserve">après un décès</w:t>
+            </w:r>
+            <w:r>
+              <w:rPr>
+                <w:rFonts w:ascii="Calibri" w:cs="Calibri" w:eastAsia="Calibri" w:hAnsi="Calibri"/>
+                <w:sz w:val="20"/>
+                <w:szCs w:val="20"/>
+              </w:rPr>
+              <w:t xml:space="preserve"> (démarchage)</w:t>
+            </w:r>
+          </w:p>
+        </w:tc>
+      </w:tr>
+      <w:tr>
+        <w:trPr>
+          <w:cantSplit/>
+        </w:trPr>
+        <w:tc>
+          <w:tcPr>
+            <w:tcW w:type="dxa" w:w="4819"/>
+            <w:tcBorders>
+              <w:top w:val="single" w:color="C9D3CD" w:sz="4"/>
+              <w:left w:val="single" w:color="C9D3CD" w:sz="4"/>
+              <w:bottom w:val="single" w:color="C9D3CD" w:sz="4"/>
+              <w:right w:val="single" w:color="C9D3CD" w:sz="4"/>
+            </w:tcBorders>
+            <w:tcMar>
+              <w:top w:type="dxa" w:w="70"/>
+              <w:left w:type="dxa" w:w="110"/>
+              <w:bottom w:type="dxa" w:w="70"/>
+              <w:right w:type="dxa" w:w="110"/>
+            </w:tcMar>
+            <w:vAlign w:val="top"/>
+          </w:tcPr>
+          <w:p>
+            <w:pPr>
+              <w:spacing w:after="40"/>
+            </w:pPr>
+            <w:r>
+              <w:rPr>
+                <w:rFonts w:ascii="Calibri" w:cs="Calibri" w:eastAsia="Calibri" w:hAnsi="Calibri"/>
+                <w:sz w:val="20"/>
+                <w:szCs w:val="20"/>
+              </w:rPr>
+              <w:t xml:space="preserve">Proposer des souvenirs personnalisés (flocage, cartes, livrets) </w:t>
+            </w:r>
+            <w:r>
+              <w:rPr>
+                <w:rFonts w:ascii="Calibri" w:cs="Calibri" w:eastAsia="Calibri" w:hAnsi="Calibri"/>
+                <w:sz w:val="20"/>
+                <w:szCs w:val="20"/>
+              </w:rPr>
+              <w:t xml:space="preserve">à la demande</w:t>
+            </w:r>
+            <w:r>
+              <w:rPr>
+                <w:rFonts w:ascii="Calibri" w:cs="Calibri" w:eastAsia="Calibri" w:hAnsi="Calibri"/>
+                <w:sz w:val="20"/>
+                <w:szCs w:val="20"/>
+              </w:rPr>
+              <w:t xml:space="preserve"> de la famille</w:t>
+            </w:r>
+          </w:p>
+        </w:tc>
+        <w:tc>
+          <w:tcPr>
+            <w:tcW w:type="dxa" w:w="4819"/>
+            <w:tcBorders>
+              <w:top w:val="single" w:color="C9D3CD" w:sz="4"/>
+              <w:left w:val="single" w:color="C9D3CD" w:sz="4"/>
+              <w:bottom w:val="single" w:color="C9D3CD" w:sz="4"/>
+              <w:right w:val="single" w:color="C9D3CD" w:sz="4"/>
+            </w:tcBorders>
+            <w:tcMar>
+              <w:top w:type="dxa" w:w="70"/>
+              <w:left w:type="dxa" w:w="110"/>
+              <w:bottom w:type="dxa" w:w="70"/>
+              <w:right w:type="dxa" w:w="110"/>
+            </w:tcMar>
+            <w:vAlign w:val="top"/>
+          </w:tcPr>
+          <w:p>
+            <w:pPr>
+              <w:spacing w:after="40"/>
+            </w:pPr>
+            <w:r>
+              <w:rPr>
+                <w:rFonts w:ascii="Calibri" w:cs="Calibri" w:eastAsia="Calibri" w:hAnsi="Calibri"/>
+                <w:sz w:val="20"/>
+                <w:szCs w:val="20"/>
+              </w:rPr>
+              <w:t xml:space="preserve">Donner une commission à un hôpital, un EHPAD, un notaire… pour te recommander</w:t>
+            </w:r>
+          </w:p>
+        </w:tc>
+      </w:tr>
+      <w:tr>
+        <w:trPr>
+          <w:cantSplit/>
+        </w:trPr>
+        <w:tc>
+          <w:tcPr>
+            <w:tcW w:type="dxa" w:w="4819"/>
+            <w:tcBorders>
+              <w:top w:val="single" w:color="C9D3CD" w:sz="4"/>
+              <w:left w:val="single" w:color="C9D3CD" w:sz="4"/>
+              <w:bottom w:val="single" w:color="C9D3CD" w:sz="4"/>
+              <w:right w:val="single" w:color="C9D3CD" w:sz="4"/>
+            </w:tcBorders>
+            <w:shd w:fill="F8FAF9" w:color="auto" w:val="clear"/>
+            <w:tcMar>
+              <w:top w:type="dxa" w:w="70"/>
+              <w:left w:type="dxa" w:w="110"/>
+              <w:bottom w:type="dxa" w:w="70"/>
+              <w:right w:type="dxa" w:w="110"/>
+            </w:tcMar>
+            <w:vAlign w:val="top"/>
+          </w:tcPr>
+          <w:p>
+            <w:pPr>
+              <w:spacing w:after="40"/>
+            </w:pPr>
+            <w:r>
+              <w:rPr>
+                <w:rFonts w:ascii="Calibri" w:cs="Calibri" w:eastAsia="Calibri" w:hAnsi="Calibri"/>
+                <w:sz w:val="20"/>
+                <w:szCs w:val="20"/>
+              </w:rPr>
+              <w:t xml:space="preserve">Écouter, accompagner, animer des ateliers et orienter vers un psychologue</w:t>
+            </w:r>
+          </w:p>
+        </w:tc>
+        <w:tc>
+          <w:tcPr>
+            <w:tcW w:type="dxa" w:w="4819"/>
+            <w:tcBorders>
+              <w:top w:val="single" w:color="C9D3CD" w:sz="4"/>
+              <w:left w:val="single" w:color="C9D3CD" w:sz="4"/>
+              <w:bottom w:val="single" w:color="C9D3CD" w:sz="4"/>
+              <w:right w:val="single" w:color="C9D3CD" w:sz="4"/>
+            </w:tcBorders>
+            <w:shd w:fill="F8FAF9" w:color="auto" w:val="clear"/>
+            <w:tcMar>
+              <w:top w:type="dxa" w:w="70"/>
+              <w:left w:type="dxa" w:w="110"/>
+              <w:bottom w:type="dxa" w:w="70"/>
+              <w:right w:type="dxa" w:w="110"/>
+            </w:tcMar>
+            <w:vAlign w:val="top"/>
+          </w:tcPr>
+          <w:p>
+            <w:pPr>
+              <w:spacing w:after="40"/>
+            </w:pPr>
+            <w:r>
+              <w:rPr>
+                <w:rFonts w:ascii="Calibri" w:cs="Calibri" w:eastAsia="Calibri" w:hAnsi="Calibri"/>
+                <w:sz w:val="20"/>
+                <w:szCs w:val="20"/>
+              </w:rPr>
+              <w:t xml:space="preserve">Te dire « psychologue » ou promettre de « soigner » le deuil sans le diplôme</w:t>
+            </w:r>
+          </w:p>
+        </w:tc>
+      </w:tr>
+      <w:tr>
+        <w:trPr>
+          <w:cantSplit/>
+        </w:trPr>
+        <w:tc>
+          <w:tcPr>
+            <w:tcW w:type="dxa" w:w="4819"/>
+            <w:tcBorders>
+              <w:top w:val="single" w:color="C9D3CD" w:sz="4"/>
+              <w:left w:val="single" w:color="C9D3CD" w:sz="4"/>
+              <w:bottom w:val="single" w:color="C9D3CD" w:sz="4"/>
+              <w:right w:val="single" w:color="C9D3CD" w:sz="4"/>
+            </w:tcBorders>
+            <w:tcMar>
+              <w:top w:type="dxa" w:w="70"/>
+              <w:left w:type="dxa" w:w="110"/>
+              <w:bottom w:type="dxa" w:w="70"/>
+              <w:right w:type="dxa" w:w="110"/>
+            </w:tcMar>
+            <w:vAlign w:val="top"/>
+          </w:tcPr>
+          <w:p>
+            <w:pPr>
+              <w:spacing w:after="40"/>
+            </w:pPr>
+            <w:r>
+              <w:rPr>
+                <w:rFonts w:ascii="Calibri" w:cs="Calibri" w:eastAsia="Calibri" w:hAnsi="Calibri"/>
+                <w:sz w:val="20"/>
+                <w:szCs w:val="20"/>
+              </w:rPr>
+              <w:t xml:space="preserve">Faire ta communication (site, Google, réseaux) tant qu’elle reste générale et passive</w:t>
+            </w:r>
+          </w:p>
+        </w:tc>
+        <w:tc>
+          <w:tcPr>
+            <w:tcW w:type="dxa" w:w="4819"/>
+            <w:tcBorders>
+              <w:top w:val="single" w:color="C9D3CD" w:sz="4"/>
+              <w:left w:val="single" w:color="C9D3CD" w:sz="4"/>
+              <w:bottom w:val="single" w:color="C9D3CD" w:sz="4"/>
+              <w:right w:val="single" w:color="C9D3CD" w:sz="4"/>
+            </w:tcBorders>
+            <w:tcMar>
+              <w:top w:type="dxa" w:w="70"/>
+              <w:left w:type="dxa" w:w="110"/>
+              <w:bottom w:type="dxa" w:w="70"/>
+              <w:right w:type="dxa" w:w="110"/>
+            </w:tcMar>
+            <w:vAlign w:val="top"/>
+          </w:tcPr>
+          <w:p>
+            <w:pPr>
+              <w:spacing w:after="40"/>
+            </w:pPr>
+            <w:r>
+              <w:rPr>
+                <w:rFonts w:ascii="Calibri" w:cs="Calibri" w:eastAsia="Calibri" w:hAnsi="Calibri"/>
+                <w:sz w:val="20"/>
+                <w:szCs w:val="20"/>
+              </w:rPr>
+              <w:t xml:space="preserve">Donner un conseil juridique ou fiscal payant, ou rédiger un acte (testament, succession)</w:t>
+            </w:r>
+          </w:p>
+        </w:tc>
+      </w:tr>
+    </w:tbl>
+    <w:p>
+      <w:pPr>
+        <w:spacing w:after="80"/>
+      </w:pPr>
     </w:p>
     <w:p>
       <w:pPr>
@@ -6680,7 +7206,7 @@
           <w:sz w:val="22"/>
           <w:szCs w:val="22"/>
         </w:rPr>
-        <w:t xml:space="preserve">Toute entreprise qui exerce ces services doit être </w:t>
+        <w:t xml:space="preserve">Pour exercer ces services, ton entreprise doit être </w:t>
       </w:r>
       <w:r>
         <w:rPr>
@@ -6698,7 +7224,17 @@
           <w:sz w:val="22"/>
           <w:szCs w:val="22"/>
         </w:rPr>
-        <w:t xml:space="preserve"> du département de son siège (CGCT L2223-23).</w:t>
+        <w:t xml:space="preserve"> du département de son siège (CGCT L2223-23). </w:t>
+      </w:r>
+      <w:r>
+        <w:rPr>
+          <w:rFonts w:ascii="Calibri" w:cs="Calibri" w:eastAsia="Calibri" w:hAnsi="Calibri"/>
+          <w:b/>
+          <w:bCs/>
+          <w:sz w:val="22"/>
+          <w:szCs w:val="22"/>
+        </w:rPr>
+        <w:t xml:space="preserve">Tu n’as pas le droit de les proposer sans cette habilitation.</w:t>
       </w:r>
     </w:p>
     <w:p>
@@ -6963,7 +7499,7 @@
                 <w:sz w:val="21"/>
                 <w:szCs w:val="21"/>
               </w:rPr>
-              <w:t xml:space="preserve">Son diplôme doit être regardé précisément : correspond-il à la capacité professionnelle de </w:t>
+              <w:t xml:space="preserve">Ton diplôme doit être regardé précisément : correspond-il à la capacité professionnelle de </w:t>
             </w:r>
             <w:r>
               <w:rPr>
@@ -7693,7 +8229,7 @@
           <w:sz w:val="24"/>
           <w:szCs w:val="24"/>
         </w:rPr>
-        <w:t xml:space="preserve">Ce que cela implique concrètement</w:t>
+        <w:t xml:space="preserve">Ce que cela veut dire pour toi, concrètement</w:t>
       </w:r>
     </w:p>
     <w:p>
@@ -7713,15 +8249,15 @@
           <w:sz w:val="22"/>
           <w:szCs w:val="22"/>
         </w:rPr>
-        <w:t xml:space="preserve">Interdit :</w:t>
-      </w:r>
-      <w:r>
-        <w:rPr>
-          <w:rFonts w:ascii="Calibri" w:cs="Calibri" w:eastAsia="Calibri" w:hAnsi="Calibri"/>
-          <w:sz w:val="22"/>
-          <w:szCs w:val="22"/>
-        </w:rPr>
-        <w:t xml:space="preserve"> contacter une famille parce qu’on a vu un avis de décès ; déposer des flyers chez les personnes endeuillées ; acheter des listes de décès ; faire de la publicité ciblée sur des personnes venant de perdre un proche.</w:t>
+        <w:t xml:space="preserve">Tu n’as pas le droit de</w:t>
+      </w:r>
+      <w:r>
+        <w:rPr>
+          <w:rFonts w:ascii="Calibri" w:cs="Calibri" w:eastAsia="Calibri" w:hAnsi="Calibri"/>
+          <w:sz w:val="22"/>
+          <w:szCs w:val="22"/>
+        </w:rPr>
+        <w:t xml:space="preserve"> contacter une famille parce que tu as vu un avis de décès, de déposer des flyers chez des personnes endeuillées, d’acheter des listes de décès, ni de faire de la publicité ciblée sur des personnes venant de perdre un proche.</w:t>
       </w:r>
     </w:p>
     <w:p>
@@ -7741,7 +8277,7 @@
           <w:sz w:val="22"/>
           <w:szCs w:val="22"/>
         </w:rPr>
-        <w:t xml:space="preserve">Interdit :</w:t>
+        <w:t xml:space="preserve">Tu n’as pas le droit de</w:t>
       </w:r>
       <w:r>
         <w:rPr>
@@ -7769,15 +8305,15 @@
           <w:sz w:val="22"/>
           <w:szCs w:val="22"/>
         </w:rPr>
-        <w:t xml:space="preserve">Permis :</w:t>
-      </w:r>
-      <w:r>
-        <w:rPr>
-          <w:rFonts w:ascii="Calibri" w:cs="Calibri" w:eastAsia="Calibri" w:hAnsi="Calibri"/>
-          <w:sz w:val="22"/>
-          <w:szCs w:val="22"/>
-        </w:rPr>
-        <w:t xml:space="preserve"> une communication </w:t>
+        <w:t xml:space="preserve">Tu as le droit de</w:t>
+      </w:r>
+      <w:r>
+        <w:rPr>
+          <w:rFonts w:ascii="Calibri" w:cs="Calibri" w:eastAsia="Calibri" w:hAnsi="Calibri"/>
+          <w:sz w:val="22"/>
+          <w:szCs w:val="22"/>
+        </w:rPr>
+        <w:t xml:space="preserve"> faire une communication </w:t>
       </w:r>
       <w:r>
         <w:rPr>
@@ -7795,7 +8331,7 @@
           <w:sz w:val="22"/>
           <w:szCs w:val="22"/>
         </w:rPr>
-        <w:t xml:space="preserve"> (site, Google, supports d’information) que la famille trouve d’elle-même ; des partenariats </w:t>
+        <w:t xml:space="preserve"> (site, Google, supports d’information) que la famille trouve d’elle-même, ainsi que des partenariats </w:t>
       </w:r>
       <w:r>
         <w:rPr>
@@ -8190,7 +8726,7 @@
           <w:sz w:val="22"/>
           <w:szCs w:val="22"/>
         </w:rPr>
-        <w:t xml:space="preserve">Aider une famille à </w:t>
+        <w:t xml:space="preserve">Tu as le droit d’aider une famille à </w:t>
       </w:r>
       <w:r>
         <w:rPr>
@@ -9188,7 +9724,7 @@
           <w:sz w:val="22"/>
           <w:szCs w:val="22"/>
         </w:rPr>
-        <w:t xml:space="preserve">Interdit de </w:t>
+        <w:t xml:space="preserve">Tu n’as pas le droit de </w:t>
       </w:r>
       <w:r>
         <w:rPr>
@@ -9472,7 +10008,7 @@
           <w:sz w:val="22"/>
           <w:szCs w:val="22"/>
         </w:rPr>
-        <w:t xml:space="preserve">Se limiter à l’entretien (nettoyage, fleurissement, désherbage, dépose de gerbes). Toute </w:t>
+        <w:t xml:space="preserve">Tu t’en tiens à l’entretien (nettoyage, fleurissement, désherbage, dépose de gerbes). Toute </w:t>
       </w:r>
       <w:r>
         <w:rPr>
@@ -9896,7 +10432,7 @@
                 <w:sz w:val="20"/>
                 <w:szCs w:val="20"/>
               </w:rPr>
-              <w:t xml:space="preserve">🟢 Libre</w:t>
+              <w:t xml:space="preserve">🟢 Tu peux</w:t>
             </w:r>
           </w:p>
         </w:tc>
@@ -9968,7 +10504,7 @@
                 <w:sz w:val="20"/>
                 <w:szCs w:val="20"/>
               </w:rPr>
-              <w:t xml:space="preserve">🟠 Encadré</w:t>
+              <w:t xml:space="preserve">🟠 Tu peux, sous conditions</w:t>
             </w:r>
           </w:p>
         </w:tc>
@@ -10041,7 +10577,7 @@
                 <w:sz w:val="20"/>
                 <w:szCs w:val="20"/>
               </w:rPr>
-              <w:t xml:space="preserve">🔴 Réservé / interdit</w:t>
+              <w:t xml:space="preserve">🔴 Tu ne peux pas (sans habilitation, diplôme ou cadre légal)</w:t>
             </w:r>
           </w:p>
         </w:tc>
@@ -24675,7 +25211,7 @@
           <w:sz w:val="28"/>
           <w:szCs w:val="28"/>
         </w:rPr>
-        <w:t xml:space="preserve">9.3 Prendre soin de la professionnelle</w:t>
+        <w:t xml:space="preserve">9.3 Prendre soin de toi</w:t>
       </w:r>
     </w:p>
     <w:p>
@@ -24688,7 +25224,7 @@
           <w:sz w:val="22"/>
           <w:szCs w:val="22"/>
         </w:rPr>
-        <w:t xml:space="preserve">Ce métier expose à la charge émotionnelle : prévoir dès le départ des </w:t>
+        <w:t xml:space="preserve">Ce métier expose à la charge émotionnelle. Prévois dès le départ des </w:t>
       </w:r>
       <w:r>
         <w:rPr>
@@ -24724,7 +25260,7 @@
           <w:sz w:val="22"/>
           <w:szCs w:val="22"/>
         </w:rPr>
-        <w:t xml:space="preserve">, des limites d’horaires, et une organisation qui permette de ne pas être joignable 24h/24 en solitaire sur la durée (permanence partagée, partenariat).</w:t>
+        <w:t xml:space="preserve">, des limites d’horaires, et une organisation qui te permette de ne pas être joignable 24h/24 en solitaire sur la durée (permanence partagée, partenariat).</w:t>
       </w:r>
     </w:p>
     <w:p>
@@ -40230,7 +40766,7 @@
                 <w:sz w:val="20"/>
                 <w:szCs w:val="20"/>
               </w:rPr>
-              <w:t xml:space="preserve"> Tenue de la professionnelle</w:t>
+              <w:t xml:space="preserve"> Ta tenue de travail</w:t>
             </w:r>
           </w:p>
         </w:tc>
@@ -40547,7 +41083,7 @@
                 <w:sz w:val="20"/>
                 <w:szCs w:val="20"/>
               </w:rPr>
-              <w:t xml:space="preserve">Reçue au rendez-vous ou par la professionnelle ; pas de proposition non sollicitée</w:t>
+              <w:t xml:space="preserve">Reçue au rendez-vous ou par toi ; pas de proposition non sollicitée</w:t>
             </w:r>
           </w:p>
         </w:tc>

</xml_diff>